<commit_message>
GE lesson plans: wider writing column, formulas kept on one line; Word: render \RR/\T and full-width plan table
Co-Authored-By: Claude Opus 5.5 <noreply@anthropic.com>
Claude-Session: https://claude.ai/code/session_015WVgZKTbSWpZTjn6aZsqC9
</commit_message>
<xml_diff>
--- a/documents/3as_ge/modhakirat/modhakira_wahda7_3as_ge.docx
+++ b/documents/3as_ge/modhakirat/modhakira_wahda7_3as_ge.docx
@@ -237,7 +237,51 @@
               <w:rPr>
                 <w:rtl/>
               </w:rPr>
-              <w:t xml:space="preserve">الحلول مفصّلة: المعطيات بالأسود ، و بلون مختلف ، وكل سؤال في سطر.</w:t>
+              <w:t xml:space="preserve">الحلول مفصّلة: المعطيات بالأسود ،</w:t>
+            </w:r>
+            <w:r>
+              <w:rPr>
+                <w:rtl/>
+              </w:rPr>
+              <w:t xml:space="preserve"> </w:t>
+            </w:r>
+            <w:r>
+              <w:rPr>
+                <w:b/>
+                <w:bCs/>
+                <w:rtl/>
+              </w:rPr>
+              <w:t xml:space="preserve">العناوين</w:t>
+            </w:r>
+            <w:r>
+              <w:rPr>
+                <w:rtl/>
+              </w:rPr>
+              <w:t xml:space="preserve"> </w:t>
+            </w:r>
+            <w:r>
+              <w:rPr>
+                <w:rtl/>
+              </w:rPr>
+              <w:t xml:space="preserve">و</w:t>
+            </w:r>
+            <w:r>
+              <w:rPr>
+                <w:rtl/>
+              </w:rPr>
+              <w:t xml:space="preserve">النتائج</w:t>
+            </w:r>
+            <w:r>
+              <w:rPr>
+                <w:rtl/>
+              </w:rPr>
+              <w:t xml:space="preserve"> </w:t>
+            </w:r>
+            <w:r>
+              <w:rPr>
+                <w:rtl/>
+              </w:rPr>
+              <w:t xml:space="preserve">بلون مختلف ، وكل سؤال في سطر.</w:t>
             </w:r>
           </w:p>
         </w:tc>
@@ -731,7 +775,7 @@
     <w:tbl>
       <w:tblPr>
         <w:tblStyle w:val="Table"/>
-        <w:tblW w:w="7681" w:type="dxa"/>
+        <w:tblW w:w="9864" w:type="dxa"/>
         <w:jc w:val="center"/>
         <w:tblBorders>
           <w:top w:val="single" w:sz="4" w:space="0" w:color="000000"/>
@@ -744,10 +788,10 @@
         <w:tblLook w:firstRow="0" w:lastRow="0" w:firstColumn="0" w:lastColumn="0" w:noHBand="0" w:noVBand="0" w:val="0000"/>
       </w:tblPr>
       <w:tblGrid>
-        <w:gridCol w:w="1188"/>
-        <w:gridCol w:w="712"/>
-        <w:gridCol w:w="4593"/>
-        <w:gridCol w:w="1188"/>
+        <w:gridCol w:w="1084"/>
+        <w:gridCol w:w="591"/>
+        <w:gridCol w:w="7004"/>
+        <w:gridCol w:w="1183"/>
       </w:tblGrid>
       <w:tr>
         <w:tc>
@@ -1051,7 +1095,7 @@
               </w:rPr>
               <w:drawing>
                 <wp:inline>
-                  <wp:extent cx="2772554" cy="179192"/>
+                  <wp:extent cx="3426604" cy="211404"/>
                   <wp:docPr id="1" name="Picture 1"/>
                   <wp:cNvGraphicFramePr>
                     <a:graphicFrameLocks noChangeAspect="1"/>
@@ -1060,7 +1104,7 @@
                     <a:graphicData uri="http://schemas.openxmlformats.org/drawingml/2006/picture">
                       <pic:pic>
                         <pic:nvPicPr>
-                          <pic:cNvPr id="0" name="8dcb174e3bb9433b.png"/>
+                          <pic:cNvPr id="0" name="7930fefe49535bc4.png"/>
                           <pic:cNvPicPr/>
                         </pic:nvPicPr>
                         <pic:blipFill>
@@ -1072,7 +1116,7 @@
                         <pic:spPr>
                           <a:xfrm>
                             <a:off x="0" y="0"/>
-                            <a:ext cx="2772554" cy="179192"/>
+                            <a:ext cx="3426604" cy="211404"/>
                           </a:xfrm>
                           <a:prstGeom prst="rect"/>
                         </pic:spPr>
@@ -1422,7 +1466,7 @@
               </w:rPr>
               <w:drawing>
                 <wp:inline>
-                  <wp:extent cx="2601468" cy="1591056"/>
+                  <wp:extent cx="2596896" cy="1591056"/>
                   <wp:docPr id="2" name="Picture 2"/>
                   <wp:cNvGraphicFramePr>
                     <a:graphicFrameLocks noChangeAspect="1"/>
@@ -1431,7 +1475,7 @@
                     <a:graphicData uri="http://schemas.openxmlformats.org/drawingml/2006/picture">
                       <pic:pic>
                         <pic:nvPicPr>
-                          <pic:cNvPr id="0" name="86b84c18561c32f7.png"/>
+                          <pic:cNvPr id="0" name="4311781294258a07.png"/>
                           <pic:cNvPicPr/>
                         </pic:nvPicPr>
                         <pic:blipFill>
@@ -1443,7 +1487,7 @@
                         <pic:spPr>
                           <a:xfrm>
                             <a:off x="0" y="0"/>
-                            <a:ext cx="2601468" cy="1591056"/>
+                            <a:ext cx="2596896" cy="1591056"/>
                           </a:xfrm>
                           <a:prstGeom prst="rect"/>
                         </pic:spPr>
@@ -1473,12 +1517,84 @@
               </w:rPr>
               <w:t xml:space="preserve"> </w:t>
             </w:r>
-            <w:r>
-              <w:rPr>
-                <w:rtl/>
-              </w:rPr>
-              <w:t xml:space="preserve">‎$\bar x=\dfrac{1+2+3+4+5}5=\RR{3}$</w:t>
-            </w:r>
+            <m:oMath>
+              <m:acc>
+                <m:accPr>
+                  <m:chr m:val="‾"/>
+                </m:accPr>
+                <m:e>
+                  <m:r>
+                    <m:t>x</m:t>
+                  </m:r>
+                </m:e>
+              </m:acc>
+              <m:r>
+                <m:rPr>
+                  <m:sty m:val="p"/>
+                </m:rPr>
+                <m:t>=</m:t>
+              </m:r>
+              <m:f>
+                <m:fPr>
+                  <m:type m:val="bar"/>
+                </m:fPr>
+                <m:num>
+                  <m:r>
+                    <m:t>1</m:t>
+                  </m:r>
+                  <m:r>
+                    <m:rPr>
+                      <m:sty m:val="p"/>
+                    </m:rPr>
+                    <m:t>+</m:t>
+                  </m:r>
+                  <m:r>
+                    <m:t>2</m:t>
+                  </m:r>
+                  <m:r>
+                    <m:rPr>
+                      <m:sty m:val="p"/>
+                    </m:rPr>
+                    <m:t>+</m:t>
+                  </m:r>
+                  <m:r>
+                    <m:t>3</m:t>
+                  </m:r>
+                  <m:r>
+                    <m:rPr>
+                      <m:sty m:val="p"/>
+                    </m:rPr>
+                    <m:t>+</m:t>
+                  </m:r>
+                  <m:r>
+                    <m:t>4</m:t>
+                  </m:r>
+                  <m:r>
+                    <m:rPr>
+                      <m:sty m:val="p"/>
+                    </m:rPr>
+                    <m:t>+</m:t>
+                  </m:r>
+                  <m:r>
+                    <m:t>5</m:t>
+                  </m:r>
+                </m:num>
+                <m:den>
+                  <m:r>
+                    <m:t>5</m:t>
+                  </m:r>
+                </m:den>
+              </m:f>
+              <m:r>
+                <m:rPr>
+                  <m:sty m:val="p"/>
+                </m:rPr>
+                <m:t>=</m:t>
+              </m:r>
+              <m:r>
+                <m:t>3</m:t>
+              </m:r>
+            </m:oMath>
             <w:r>
               <w:rPr>
                 <w:rtl/>
@@ -1497,12 +1613,105 @@
               </w:rPr>
               <w:t xml:space="preserve"> </w:t>
             </w:r>
-            <w:r>
-              <w:rPr>
-                <w:rtl/>
-              </w:rPr>
-              <w:t xml:space="preserve">‎$\bar y=\dfrac{120+150+170+205+230}5=\dfrac{875}5=\RR{175}$</w:t>
-            </w:r>
+            <m:oMath>
+              <m:acc>
+                <m:accPr>
+                  <m:chr m:val="‾"/>
+                </m:accPr>
+                <m:e>
+                  <m:r>
+                    <m:t>y</m:t>
+                  </m:r>
+                </m:e>
+              </m:acc>
+              <m:r>
+                <m:rPr>
+                  <m:sty m:val="p"/>
+                </m:rPr>
+                <m:t>=</m:t>
+              </m:r>
+              <m:f>
+                <m:fPr>
+                  <m:type m:val="bar"/>
+                </m:fPr>
+                <m:num>
+                  <m:r>
+                    <m:t>120</m:t>
+                  </m:r>
+                  <m:r>
+                    <m:rPr>
+                      <m:sty m:val="p"/>
+                    </m:rPr>
+                    <m:t>+</m:t>
+                  </m:r>
+                  <m:r>
+                    <m:t>150</m:t>
+                  </m:r>
+                  <m:r>
+                    <m:rPr>
+                      <m:sty m:val="p"/>
+                    </m:rPr>
+                    <m:t>+</m:t>
+                  </m:r>
+                  <m:r>
+                    <m:t>170</m:t>
+                  </m:r>
+                  <m:r>
+                    <m:rPr>
+                      <m:sty m:val="p"/>
+                    </m:rPr>
+                    <m:t>+</m:t>
+                  </m:r>
+                  <m:r>
+                    <m:t>205</m:t>
+                  </m:r>
+                  <m:r>
+                    <m:rPr>
+                      <m:sty m:val="p"/>
+                    </m:rPr>
+                    <m:t>+</m:t>
+                  </m:r>
+                  <m:r>
+                    <m:t>230</m:t>
+                  </m:r>
+                </m:num>
+                <m:den>
+                  <m:r>
+                    <m:t>5</m:t>
+                  </m:r>
+                </m:den>
+              </m:f>
+              <m:r>
+                <m:rPr>
+                  <m:sty m:val="p"/>
+                </m:rPr>
+                <m:t>=</m:t>
+              </m:r>
+              <m:f>
+                <m:fPr>
+                  <m:type m:val="bar"/>
+                </m:fPr>
+                <m:num>
+                  <m:r>
+                    <m:t>875</m:t>
+                  </m:r>
+                </m:num>
+                <m:den>
+                  <m:r>
+                    <m:t>5</m:t>
+                  </m:r>
+                </m:den>
+              </m:f>
+              <m:r>
+                <m:rPr>
+                  <m:sty m:val="p"/>
+                </m:rPr>
+                <m:t>=</m:t>
+              </m:r>
+              <m:r>
+                <m:t>175</m:t>
+              </m:r>
+            </m:oMath>
             <w:r>
               <w:rPr>
                 <w:rtl/>
@@ -1515,12 +1724,33 @@
               </w:rPr>
               <w:t xml:space="preserve"> </w:t>
             </w:r>
-            <w:r>
-              <w:rPr>
-                <w:rtl/>
-              </w:rPr>
-              <w:t xml:space="preserve">‎$\RR{G(3;175)}$</w:t>
-            </w:r>
+            <m:oMath>
+              <m:r>
+                <m:t>G</m:t>
+              </m:r>
+              <m:d>
+                <m:dPr>
+                  <m:begChr m:val="("/>
+                  <m:endChr m:val=")"/>
+                  <m:sepChr m:val=""/>
+                  <m:grow/>
+                </m:dPr>
+                <m:e>
+                  <m:r>
+                    <m:t>3</m:t>
+                  </m:r>
+                  <m:r>
+                    <m:rPr>
+                      <m:sty m:val="p"/>
+                    </m:rPr>
+                    <m:t>;</m:t>
+                  </m:r>
+                  <m:r>
+                    <m:t>175</m:t>
+                  </m:r>
+                </m:e>
+              </m:d>
+            </m:oMath>
             <w:r>
               <w:rPr>
                 <w:rtl/>
@@ -1854,12 +2084,47 @@
               </w:rPr>
               <w:t xml:space="preserve"> </w:t>
             </w:r>
-            <w:r>
-              <w:rPr>
-                <w:rtl/>
-              </w:rPr>
-              <w:t xml:space="preserve">‎$\RR{G(\bar x;\bar y)}$</w:t>
-            </w:r>
+            <m:oMath>
+              <m:r>
+                <m:t>G</m:t>
+              </m:r>
+              <m:d>
+                <m:dPr>
+                  <m:begChr m:val="("/>
+                  <m:endChr m:val=")"/>
+                  <m:sepChr m:val=""/>
+                  <m:grow/>
+                </m:dPr>
+                <m:e>
+                  <m:acc>
+                    <m:accPr>
+                      <m:chr m:val="‾"/>
+                    </m:accPr>
+                    <m:e>
+                      <m:r>
+                        <m:t>x</m:t>
+                      </m:r>
+                    </m:e>
+                  </m:acc>
+                  <m:r>
+                    <m:rPr>
+                      <m:sty m:val="p"/>
+                    </m:rPr>
+                    <m:t>;</m:t>
+                  </m:r>
+                  <m:acc>
+                    <m:accPr>
+                      <m:chr m:val="‾"/>
+                    </m:accPr>
+                    <m:e>
+                      <m:r>
+                        <m:t>y</m:t>
+                      </m:r>
+                    </m:e>
+                  </m:acc>
+                </m:e>
+              </m:d>
+            </m:oMath>
             <w:r>
               <w:rPr>
                 <w:rtl/>
@@ -2193,7 +2458,7 @@
               </w:rPr>
               <w:drawing>
                 <wp:inline>
-                  <wp:extent cx="2772554" cy="174967"/>
+                  <wp:extent cx="3426604" cy="206641"/>
                   <wp:docPr id="3" name="Picture 3"/>
                   <wp:cNvGraphicFramePr>
                     <a:graphicFrameLocks noChangeAspect="1"/>
@@ -2202,7 +2467,7 @@
                     <a:graphicData uri="http://schemas.openxmlformats.org/drawingml/2006/picture">
                       <pic:pic>
                         <pic:nvPicPr>
-                          <pic:cNvPr id="0" name="c9ebddd502cf4c47.png"/>
+                          <pic:cNvPr id="0" name="5e061f6d237e6791.png"/>
                           <pic:cNvPicPr/>
                         </pic:nvPicPr>
                         <pic:blipFill>
@@ -2214,7 +2479,7 @@
                         <pic:spPr>
                           <a:xfrm>
                             <a:off x="0" y="0"/>
-                            <a:ext cx="2772554" cy="174967"/>
+                            <a:ext cx="3426604" cy="206641"/>
                           </a:xfrm>
                           <a:prstGeom prst="rect"/>
                         </pic:spPr>
@@ -2244,12 +2509,123 @@
               </w:rPr>
               <w:t xml:space="preserve"> </w:t>
             </w:r>
-            <w:r>
-              <w:rPr>
-                <w:rtl/>
-              </w:rPr>
-              <w:t xml:space="preserve">‎$\bar x=\dfrac{25+30+35+40+45+50}6=\dfrac{225}6=\RR{37{,}5}$</w:t>
-            </w:r>
+            <m:oMath>
+              <m:acc>
+                <m:accPr>
+                  <m:chr m:val="‾"/>
+                </m:accPr>
+                <m:e>
+                  <m:r>
+                    <m:t>x</m:t>
+                  </m:r>
+                </m:e>
+              </m:acc>
+              <m:r>
+                <m:rPr>
+                  <m:sty m:val="p"/>
+                </m:rPr>
+                <m:t>=</m:t>
+              </m:r>
+              <m:f>
+                <m:fPr>
+                  <m:type m:val="bar"/>
+                </m:fPr>
+                <m:num>
+                  <m:r>
+                    <m:t>25</m:t>
+                  </m:r>
+                  <m:r>
+                    <m:rPr>
+                      <m:sty m:val="p"/>
+                    </m:rPr>
+                    <m:t>+</m:t>
+                  </m:r>
+                  <m:r>
+                    <m:t>30</m:t>
+                  </m:r>
+                  <m:r>
+                    <m:rPr>
+                      <m:sty m:val="p"/>
+                    </m:rPr>
+                    <m:t>+</m:t>
+                  </m:r>
+                  <m:r>
+                    <m:t>35</m:t>
+                  </m:r>
+                  <m:r>
+                    <m:rPr>
+                      <m:sty m:val="p"/>
+                    </m:rPr>
+                    <m:t>+</m:t>
+                  </m:r>
+                  <m:r>
+                    <m:t>40</m:t>
+                  </m:r>
+                  <m:r>
+                    <m:rPr>
+                      <m:sty m:val="p"/>
+                    </m:rPr>
+                    <m:t>+</m:t>
+                  </m:r>
+                  <m:r>
+                    <m:t>45</m:t>
+                  </m:r>
+                  <m:r>
+                    <m:rPr>
+                      <m:sty m:val="p"/>
+                    </m:rPr>
+                    <m:t>+</m:t>
+                  </m:r>
+                  <m:r>
+                    <m:t>50</m:t>
+                  </m:r>
+                </m:num>
+                <m:den>
+                  <m:r>
+                    <m:t>6</m:t>
+                  </m:r>
+                </m:den>
+              </m:f>
+              <m:r>
+                <m:rPr>
+                  <m:sty m:val="p"/>
+                </m:rPr>
+                <m:t>=</m:t>
+              </m:r>
+              <m:f>
+                <m:fPr>
+                  <m:type m:val="bar"/>
+                </m:fPr>
+                <m:num>
+                  <m:r>
+                    <m:t>225</m:t>
+                  </m:r>
+                </m:num>
+                <m:den>
+                  <m:r>
+                    <m:t>6</m:t>
+                  </m:r>
+                </m:den>
+              </m:f>
+              <m:r>
+                <m:rPr>
+                  <m:sty m:val="p"/>
+                </m:rPr>
+                <m:t>=</m:t>
+              </m:r>
+              <m:r>
+                <m:t>37</m:t>
+              </m:r>
+              <m:r>
+                <m:rPr>
+                  <m:sty m:val="p"/>
+                </m:rPr>
+                <m:t>,</m:t>
+              </m:r>
+              <m:r>
+                <m:t>5</m:t>
+              </m:r>
+            </m:oMath>
             <w:r>
               <w:rPr>
                 <w:rtl/>
@@ -2276,12 +2652,114 @@
               </w:rPr>
               <w:t xml:space="preserve"> </w:t>
             </w:r>
-            <w:r>
-              <w:rPr>
-                <w:rtl/>
-              </w:rPr>
-              <w:t xml:space="preserve">‎$\bar y=\dfrac{32+36+41+43+48+52}6=\dfrac{252}6=\RR{42}$</w:t>
-            </w:r>
+            <m:oMath>
+              <m:acc>
+                <m:accPr>
+                  <m:chr m:val="‾"/>
+                </m:accPr>
+                <m:e>
+                  <m:r>
+                    <m:t>y</m:t>
+                  </m:r>
+                </m:e>
+              </m:acc>
+              <m:r>
+                <m:rPr>
+                  <m:sty m:val="p"/>
+                </m:rPr>
+                <m:t>=</m:t>
+              </m:r>
+              <m:f>
+                <m:fPr>
+                  <m:type m:val="bar"/>
+                </m:fPr>
+                <m:num>
+                  <m:r>
+                    <m:t>32</m:t>
+                  </m:r>
+                  <m:r>
+                    <m:rPr>
+                      <m:sty m:val="p"/>
+                    </m:rPr>
+                    <m:t>+</m:t>
+                  </m:r>
+                  <m:r>
+                    <m:t>36</m:t>
+                  </m:r>
+                  <m:r>
+                    <m:rPr>
+                      <m:sty m:val="p"/>
+                    </m:rPr>
+                    <m:t>+</m:t>
+                  </m:r>
+                  <m:r>
+                    <m:t>41</m:t>
+                  </m:r>
+                  <m:r>
+                    <m:rPr>
+                      <m:sty m:val="p"/>
+                    </m:rPr>
+                    <m:t>+</m:t>
+                  </m:r>
+                  <m:r>
+                    <m:t>43</m:t>
+                  </m:r>
+                  <m:r>
+                    <m:rPr>
+                      <m:sty m:val="p"/>
+                    </m:rPr>
+                    <m:t>+</m:t>
+                  </m:r>
+                  <m:r>
+                    <m:t>48</m:t>
+                  </m:r>
+                  <m:r>
+                    <m:rPr>
+                      <m:sty m:val="p"/>
+                    </m:rPr>
+                    <m:t>+</m:t>
+                  </m:r>
+                  <m:r>
+                    <m:t>52</m:t>
+                  </m:r>
+                </m:num>
+                <m:den>
+                  <m:r>
+                    <m:t>6</m:t>
+                  </m:r>
+                </m:den>
+              </m:f>
+              <m:r>
+                <m:rPr>
+                  <m:sty m:val="p"/>
+                </m:rPr>
+                <m:t>=</m:t>
+              </m:r>
+              <m:f>
+                <m:fPr>
+                  <m:type m:val="bar"/>
+                </m:fPr>
+                <m:num>
+                  <m:r>
+                    <m:t>252</m:t>
+                  </m:r>
+                </m:num>
+                <m:den>
+                  <m:r>
+                    <m:t>6</m:t>
+                  </m:r>
+                </m:den>
+              </m:f>
+              <m:r>
+                <m:rPr>
+                  <m:sty m:val="p"/>
+                </m:rPr>
+                <m:t>=</m:t>
+              </m:r>
+              <m:r>
+                <m:t>42</m:t>
+              </m:r>
+            </m:oMath>
             <w:r>
               <w:rPr>
                 <w:rtl/>
@@ -2300,12 +2778,42 @@
               </w:rPr>
               <w:t xml:space="preserve"> </w:t>
             </w:r>
-            <w:r>
-              <w:rPr>
-                <w:rtl/>
-              </w:rPr>
-              <w:t xml:space="preserve">‎$\RR{G(37{,}5;42)}$</w:t>
-            </w:r>
+            <m:oMath>
+              <m:r>
+                <m:t>G</m:t>
+              </m:r>
+              <m:d>
+                <m:dPr>
+                  <m:begChr m:val="("/>
+                  <m:endChr m:val=")"/>
+                  <m:sepChr m:val=""/>
+                  <m:grow/>
+                </m:dPr>
+                <m:e>
+                  <m:r>
+                    <m:t>37</m:t>
+                  </m:r>
+                  <m:r>
+                    <m:rPr>
+                      <m:sty m:val="p"/>
+                    </m:rPr>
+                    <m:t>,</m:t>
+                  </m:r>
+                  <m:r>
+                    <m:t>5</m:t>
+                  </m:r>
+                  <m:r>
+                    <m:rPr>
+                      <m:sty m:val="p"/>
+                    </m:rPr>
+                    <m:t>;</m:t>
+                  </m:r>
+                  <m:r>
+                    <m:t>42</m:t>
+                  </m:r>
+                </m:e>
+              </m:d>
+            </m:oMath>
             <w:r>
               <w:rPr>
                 <w:rtl/>
@@ -2441,12 +2949,61 @@
               </w:rPr>
               <w:t xml:space="preserve"> </w:t>
             </w:r>
-            <w:r>
-              <w:rPr>
-                <w:rtl/>
-              </w:rPr>
-              <w:t xml:space="preserve">‎$\bar z=\bar x-35=\RR{2{,}5}$</w:t>
-            </w:r>
+            <m:oMath>
+              <m:acc>
+                <m:accPr>
+                  <m:chr m:val="‾"/>
+                </m:accPr>
+                <m:e>
+                  <m:r>
+                    <m:t>z</m:t>
+                  </m:r>
+                </m:e>
+              </m:acc>
+              <m:r>
+                <m:rPr>
+                  <m:sty m:val="p"/>
+                </m:rPr>
+                <m:t>=</m:t>
+              </m:r>
+              <m:acc>
+                <m:accPr>
+                  <m:chr m:val="‾"/>
+                </m:accPr>
+                <m:e>
+                  <m:r>
+                    <m:t>x</m:t>
+                  </m:r>
+                </m:e>
+              </m:acc>
+              <m:r>
+                <m:rPr>
+                  <m:sty m:val="p"/>
+                </m:rPr>
+                <m:t>−</m:t>
+              </m:r>
+              <m:r>
+                <m:t>35</m:t>
+              </m:r>
+              <m:r>
+                <m:rPr>
+                  <m:sty m:val="p"/>
+                </m:rPr>
+                <m:t>=</m:t>
+              </m:r>
+              <m:r>
+                <m:t>2</m:t>
+              </m:r>
+              <m:r>
+                <m:rPr>
+                  <m:sty m:val="p"/>
+                </m:rPr>
+                <m:t>,</m:t>
+              </m:r>
+              <m:r>
+                <m:t>5</m:t>
+              </m:r>
+            </m:oMath>
             <w:r>
               <w:rPr>
                 <w:rtl/>
@@ -2674,7 +3231,7 @@
               </w:rPr>
               <w:drawing>
                 <wp:inline>
-                  <wp:extent cx="2772554" cy="174967"/>
+                  <wp:extent cx="3426604" cy="206641"/>
                   <wp:docPr id="4" name="Picture 4"/>
                   <wp:cNvGraphicFramePr>
                     <a:graphicFrameLocks noChangeAspect="1"/>
@@ -2683,7 +3240,7 @@
                     <a:graphicData uri="http://schemas.openxmlformats.org/drawingml/2006/picture">
                       <pic:pic>
                         <pic:nvPicPr>
-                          <pic:cNvPr id="0" name="9d04a47b7f0e8add.png"/>
+                          <pic:cNvPr id="0" name="bb7f00742308100c.png"/>
                           <pic:cNvPicPr/>
                         </pic:nvPicPr>
                         <pic:blipFill>
@@ -2695,7 +3252,7 @@
                         <pic:spPr>
                           <a:xfrm>
                             <a:off x="0" y="0"/>
-                            <a:ext cx="2772554" cy="174967"/>
+                            <a:ext cx="3426604" cy="206641"/>
                           </a:xfrm>
                           <a:prstGeom prst="rect"/>
                         </pic:spPr>
@@ -2913,12 +3470,57 @@
               </w:rPr>
               <w:t xml:space="preserve"> </w:t>
             </w:r>
-            <w:r>
-              <w:rPr>
-                <w:rtl/>
-              </w:rPr>
-              <w:t xml:space="preserve">‎$\bar x=\dfrac{21}6=\RR{3{,}5}$</w:t>
-            </w:r>
+            <m:oMath>
+              <m:acc>
+                <m:accPr>
+                  <m:chr m:val="‾"/>
+                </m:accPr>
+                <m:e>
+                  <m:r>
+                    <m:t>x</m:t>
+                  </m:r>
+                </m:e>
+              </m:acc>
+              <m:r>
+                <m:rPr>
+                  <m:sty m:val="p"/>
+                </m:rPr>
+                <m:t>=</m:t>
+              </m:r>
+              <m:f>
+                <m:fPr>
+                  <m:type m:val="bar"/>
+                </m:fPr>
+                <m:num>
+                  <m:r>
+                    <m:t>21</m:t>
+                  </m:r>
+                </m:num>
+                <m:den>
+                  <m:r>
+                    <m:t>6</m:t>
+                  </m:r>
+                </m:den>
+              </m:f>
+              <m:r>
+                <m:rPr>
+                  <m:sty m:val="p"/>
+                </m:rPr>
+                <m:t>=</m:t>
+              </m:r>
+              <m:r>
+                <m:t>3</m:t>
+              </m:r>
+              <m:r>
+                <m:rPr>
+                  <m:sty m:val="p"/>
+                </m:rPr>
+                <m:t>,</m:t>
+              </m:r>
+              <m:r>
+                <m:t>5</m:t>
+              </m:r>
+            </m:oMath>
             <w:r>
               <w:rPr>
                 <w:rtl/>
@@ -2937,12 +3539,114 @@
               </w:rPr>
               <w:t xml:space="preserve"> </w:t>
             </w:r>
-            <w:r>
-              <w:rPr>
-                <w:rtl/>
-              </w:rPr>
-              <w:t xml:space="preserve">‎$\bar y=\dfrac{12+15+19+22+26+32}6=\dfrac{126}6=\RR{21}$</w:t>
-            </w:r>
+            <m:oMath>
+              <m:acc>
+                <m:accPr>
+                  <m:chr m:val="‾"/>
+                </m:accPr>
+                <m:e>
+                  <m:r>
+                    <m:t>y</m:t>
+                  </m:r>
+                </m:e>
+              </m:acc>
+              <m:r>
+                <m:rPr>
+                  <m:sty m:val="p"/>
+                </m:rPr>
+                <m:t>=</m:t>
+              </m:r>
+              <m:f>
+                <m:fPr>
+                  <m:type m:val="bar"/>
+                </m:fPr>
+                <m:num>
+                  <m:r>
+                    <m:t>12</m:t>
+                  </m:r>
+                  <m:r>
+                    <m:rPr>
+                      <m:sty m:val="p"/>
+                    </m:rPr>
+                    <m:t>+</m:t>
+                  </m:r>
+                  <m:r>
+                    <m:t>15</m:t>
+                  </m:r>
+                  <m:r>
+                    <m:rPr>
+                      <m:sty m:val="p"/>
+                    </m:rPr>
+                    <m:t>+</m:t>
+                  </m:r>
+                  <m:r>
+                    <m:t>19</m:t>
+                  </m:r>
+                  <m:r>
+                    <m:rPr>
+                      <m:sty m:val="p"/>
+                    </m:rPr>
+                    <m:t>+</m:t>
+                  </m:r>
+                  <m:r>
+                    <m:t>22</m:t>
+                  </m:r>
+                  <m:r>
+                    <m:rPr>
+                      <m:sty m:val="p"/>
+                    </m:rPr>
+                    <m:t>+</m:t>
+                  </m:r>
+                  <m:r>
+                    <m:t>26</m:t>
+                  </m:r>
+                  <m:r>
+                    <m:rPr>
+                      <m:sty m:val="p"/>
+                    </m:rPr>
+                    <m:t>+</m:t>
+                  </m:r>
+                  <m:r>
+                    <m:t>32</m:t>
+                  </m:r>
+                </m:num>
+                <m:den>
+                  <m:r>
+                    <m:t>6</m:t>
+                  </m:r>
+                </m:den>
+              </m:f>
+              <m:r>
+                <m:rPr>
+                  <m:sty m:val="p"/>
+                </m:rPr>
+                <m:t>=</m:t>
+              </m:r>
+              <m:f>
+                <m:fPr>
+                  <m:type m:val="bar"/>
+                </m:fPr>
+                <m:num>
+                  <m:r>
+                    <m:t>126</m:t>
+                  </m:r>
+                </m:num>
+                <m:den>
+                  <m:r>
+                    <m:t>6</m:t>
+                  </m:r>
+                </m:den>
+              </m:f>
+              <m:r>
+                <m:rPr>
+                  <m:sty m:val="p"/>
+                </m:rPr>
+                <m:t>=</m:t>
+              </m:r>
+              <m:r>
+                <m:t>21</m:t>
+              </m:r>
+            </m:oMath>
             <w:r>
               <w:rPr>
                 <w:rtl/>
@@ -2969,12 +3673,42 @@
               </w:rPr>
               <w:t xml:space="preserve"> </w:t>
             </w:r>
-            <w:r>
-              <w:rPr>
-                <w:rtl/>
-              </w:rPr>
-              <w:t xml:space="preserve">‎$\RR{G(3{,}5;21)}$</w:t>
-            </w:r>
+            <m:oMath>
+              <m:r>
+                <m:t>G</m:t>
+              </m:r>
+              <m:d>
+                <m:dPr>
+                  <m:begChr m:val="("/>
+                  <m:endChr m:val=")"/>
+                  <m:sepChr m:val=""/>
+                  <m:grow/>
+                </m:dPr>
+                <m:e>
+                  <m:r>
+                    <m:t>3</m:t>
+                  </m:r>
+                  <m:r>
+                    <m:rPr>
+                      <m:sty m:val="p"/>
+                    </m:rPr>
+                    <m:t>,</m:t>
+                  </m:r>
+                  <m:r>
+                    <m:t>5</m:t>
+                  </m:r>
+                  <m:r>
+                    <m:rPr>
+                      <m:sty m:val="p"/>
+                    </m:rPr>
+                    <m:t>;</m:t>
+                  </m:r>
+                  <m:r>
+                    <m:t>21</m:t>
+                  </m:r>
+                </m:e>
+              </m:d>
+            </m:oMath>
             <w:r>
               <w:rPr>
                 <w:rtl/>
@@ -3522,7 +4256,7 @@
     <w:tbl>
       <w:tblPr>
         <w:tblStyle w:val="Table"/>
-        <w:tblW w:w="7681" w:type="dxa"/>
+        <w:tblW w:w="9864" w:type="dxa"/>
         <w:jc w:val="center"/>
         <w:tblBorders>
           <w:top w:val="single" w:sz="4" w:space="0" w:color="000000"/>
@@ -3535,10 +4269,10 @@
         <w:tblLook w:firstRow="0" w:lastRow="0" w:firstColumn="0" w:lastColumn="0" w:noHBand="0" w:noVBand="0" w:val="0000"/>
       </w:tblPr>
       <w:tblGrid>
-        <w:gridCol w:w="1188"/>
-        <w:gridCol w:w="712"/>
-        <w:gridCol w:w="4593"/>
-        <w:gridCol w:w="1188"/>
+        <w:gridCol w:w="1084"/>
+        <w:gridCol w:w="591"/>
+        <w:gridCol w:w="7004"/>
+        <w:gridCol w:w="1183"/>
       </w:tblGrid>
       <w:tr>
         <w:tc>
@@ -4002,12 +4736,128 @@
               </w:rPr>
               <w:t xml:space="preserve"> </w:t>
             </w:r>
-            <w:r>
-              <w:rPr>
-                <w:rtl/>
-              </w:rPr>
-              <w:t xml:space="preserve">‎$\RR{S=M_1P_1^2+M_2P_2^2+\dots+M_nP_n^2}$</w:t>
-            </w:r>
+            <m:oMath>
+              <m:r>
+                <m:t>S</m:t>
+              </m:r>
+              <m:r>
+                <m:rPr>
+                  <m:sty m:val="p"/>
+                </m:rPr>
+                <m:t>=</m:t>
+              </m:r>
+              <m:sSub>
+                <m:e>
+                  <m:r>
+                    <m:t>M</m:t>
+                  </m:r>
+                </m:e>
+                <m:sub>
+                  <m:r>
+                    <m:t>1</m:t>
+                  </m:r>
+                </m:sub>
+              </m:sSub>
+              <m:sSubSup>
+                <m:e>
+                  <m:r>
+                    <m:t>P</m:t>
+                  </m:r>
+                </m:e>
+                <m:sub>
+                  <m:r>
+                    <m:t>1</m:t>
+                  </m:r>
+                </m:sub>
+                <m:sup>
+                  <m:r>
+                    <m:t>2</m:t>
+                  </m:r>
+                </m:sup>
+              </m:sSubSup>
+              <m:r>
+                <m:rPr>
+                  <m:sty m:val="p"/>
+                </m:rPr>
+                <m:t>+</m:t>
+              </m:r>
+              <m:sSub>
+                <m:e>
+                  <m:r>
+                    <m:t>M</m:t>
+                  </m:r>
+                </m:e>
+                <m:sub>
+                  <m:r>
+                    <m:t>2</m:t>
+                  </m:r>
+                </m:sub>
+              </m:sSub>
+              <m:sSubSup>
+                <m:e>
+                  <m:r>
+                    <m:t>P</m:t>
+                  </m:r>
+                </m:e>
+                <m:sub>
+                  <m:r>
+                    <m:t>2</m:t>
+                  </m:r>
+                </m:sub>
+                <m:sup>
+                  <m:r>
+                    <m:t>2</m:t>
+                  </m:r>
+                </m:sup>
+              </m:sSubSup>
+              <m:r>
+                <m:rPr>
+                  <m:sty m:val="p"/>
+                </m:rPr>
+                <m:t>+</m:t>
+              </m:r>
+              <m:r>
+                <m:rPr>
+                  <m:sty m:val="p"/>
+                </m:rPr>
+                <m:t>…</m:t>
+              </m:r>
+              <m:r>
+                <m:rPr>
+                  <m:sty m:val="p"/>
+                </m:rPr>
+                <m:t>+</m:t>
+              </m:r>
+              <m:sSub>
+                <m:e>
+                  <m:r>
+                    <m:t>M</m:t>
+                  </m:r>
+                </m:e>
+                <m:sub>
+                  <m:r>
+                    <m:t>n</m:t>
+                  </m:r>
+                </m:sub>
+              </m:sSub>
+              <m:sSubSup>
+                <m:e>
+                  <m:r>
+                    <m:t>P</m:t>
+                  </m:r>
+                </m:e>
+                <m:sub>
+                  <m:r>
+                    <m:t>n</m:t>
+                  </m:r>
+                </m:sub>
+                <m:sup>
+                  <m:r>
+                    <m:t>2</m:t>
+                  </m:r>
+                </m:sup>
+              </m:sSubSup>
+            </m:oMath>
             <w:r>
               <w:rPr>
                 <w:rtl/>
@@ -4338,12 +5188,168 @@
               <w:bidi/>
               <w:jc w:val="left"/>
             </w:pPr>
-            <w:r>
-              <w:rPr>
-                <w:rtl/>
-              </w:rPr>
-              <w:t xml:space="preserve">‎$\RR{a=\dfrac{\frac1n\sum x_iy_i-\bar x\,\bar y}{\frac1n\sum(x_i-\bar x)^2}}$</w:t>
-            </w:r>
+            <m:oMath>
+              <m:r>
+                <m:t>a</m:t>
+              </m:r>
+              <m:r>
+                <m:rPr>
+                  <m:sty m:val="p"/>
+                </m:rPr>
+                <m:t>=</m:t>
+              </m:r>
+              <m:f>
+                <m:fPr>
+                  <m:type m:val="bar"/>
+                </m:fPr>
+                <m:num>
+                  <m:f>
+                    <m:fPr>
+                      <m:type m:val="bar"/>
+                    </m:fPr>
+                    <m:num>
+                      <m:r>
+                        <m:t>1</m:t>
+                      </m:r>
+                    </m:num>
+                    <m:den>
+                      <m:r>
+                        <m:t>n</m:t>
+                      </m:r>
+                    </m:den>
+                  </m:f>
+                  <m:r>
+                    <m:rPr>
+                      <m:sty m:val="p"/>
+                    </m:rPr>
+                    <m:t>∑</m:t>
+                  </m:r>
+                  <m:sSub>
+                    <m:e>
+                      <m:r>
+                        <m:t>x</m:t>
+                      </m:r>
+                    </m:e>
+                    <m:sub>
+                      <m:r>
+                        <m:t>i</m:t>
+                      </m:r>
+                    </m:sub>
+                  </m:sSub>
+                  <m:sSub>
+                    <m:e>
+                      <m:r>
+                        <m:t>y</m:t>
+                      </m:r>
+                    </m:e>
+                    <m:sub>
+                      <m:r>
+                        <m:t>i</m:t>
+                      </m:r>
+                    </m:sub>
+                  </m:sSub>
+                  <m:r>
+                    <m:rPr>
+                      <m:sty m:val="p"/>
+                    </m:rPr>
+                    <m:t>−</m:t>
+                  </m:r>
+                  <m:acc>
+                    <m:accPr>
+                      <m:chr m:val="‾"/>
+                    </m:accPr>
+                    <m:e>
+                      <m:r>
+                        <m:t>x</m:t>
+                      </m:r>
+                    </m:e>
+                  </m:acc>
+                  <m:r>
+                    <m:t> </m:t>
+                  </m:r>
+                  <m:acc>
+                    <m:accPr>
+                      <m:chr m:val="‾"/>
+                    </m:accPr>
+                    <m:e>
+                      <m:r>
+                        <m:t>y</m:t>
+                      </m:r>
+                    </m:e>
+                  </m:acc>
+                </m:num>
+                <m:den>
+                  <m:f>
+                    <m:fPr>
+                      <m:type m:val="bar"/>
+                    </m:fPr>
+                    <m:num>
+                      <m:r>
+                        <m:t>1</m:t>
+                      </m:r>
+                    </m:num>
+                    <m:den>
+                      <m:r>
+                        <m:t>n</m:t>
+                      </m:r>
+                    </m:den>
+                  </m:f>
+                  <m:r>
+                    <m:rPr>
+                      <m:sty m:val="p"/>
+                    </m:rPr>
+                    <m:t>∑</m:t>
+                  </m:r>
+                  <m:sSup>
+                    <m:e>
+                      <m:d>
+                        <m:dPr>
+                          <m:begChr m:val="("/>
+                          <m:endChr m:val=")"/>
+                          <m:sepChr m:val=""/>
+                          <m:grow/>
+                        </m:dPr>
+                        <m:e>
+                          <m:sSub>
+                            <m:e>
+                              <m:r>
+                                <m:t>x</m:t>
+                              </m:r>
+                            </m:e>
+                            <m:sub>
+                              <m:r>
+                                <m:t>i</m:t>
+                              </m:r>
+                            </m:sub>
+                          </m:sSub>
+                          <m:r>
+                            <m:rPr>
+                              <m:sty m:val="p"/>
+                            </m:rPr>
+                            <m:t>−</m:t>
+                          </m:r>
+                          <m:acc>
+                            <m:accPr>
+                              <m:chr m:val="‾"/>
+                            </m:accPr>
+                            <m:e>
+                              <m:r>
+                                <m:t>x</m:t>
+                              </m:r>
+                            </m:e>
+                          </m:acc>
+                        </m:e>
+                      </m:d>
+                    </m:e>
+                    <m:sup>
+                      <m:r>
+                        <m:t>2</m:t>
+                      </m:r>
+                    </m:sup>
+                  </m:sSup>
+                </m:den>
+              </m:f>
+            </m:oMath>
             <w:r>
               <w:rPr>
                 <w:rtl/>
@@ -4362,12 +5368,46 @@
               </w:rPr>
               <w:t xml:space="preserve"> </w:t>
             </w:r>
-            <w:r>
-              <w:rPr>
-                <w:rtl/>
-              </w:rPr>
-              <w:t xml:space="preserve">‎$\RR{b=\bar y-a\bar x}$</w:t>
-            </w:r>
+            <m:oMath>
+              <m:r>
+                <m:t>b</m:t>
+              </m:r>
+              <m:r>
+                <m:rPr>
+                  <m:sty m:val="p"/>
+                </m:rPr>
+                <m:t>=</m:t>
+              </m:r>
+              <m:acc>
+                <m:accPr>
+                  <m:chr m:val="‾"/>
+                </m:accPr>
+                <m:e>
+                  <m:r>
+                    <m:t>y</m:t>
+                  </m:r>
+                </m:e>
+              </m:acc>
+              <m:r>
+                <m:rPr>
+                  <m:sty m:val="p"/>
+                </m:rPr>
+                <m:t>−</m:t>
+              </m:r>
+              <m:r>
+                <m:t>a</m:t>
+              </m:r>
+              <m:acc>
+                <m:accPr>
+                  <m:chr m:val="‾"/>
+                </m:accPr>
+                <m:e>
+                  <m:r>
+                    <m:t>x</m:t>
+                  </m:r>
+                </m:e>
+              </m:acc>
+            </m:oMath>
             <w:r>
               <w:rPr>
                 <w:rtl/>
@@ -4449,7 +5489,7 @@
               </w:rPr>
               <w:drawing>
                 <wp:inline>
-                  <wp:extent cx="2772554" cy="344166"/>
+                  <wp:extent cx="3426604" cy="406469"/>
                   <wp:docPr id="5" name="Picture 5"/>
                   <wp:cNvGraphicFramePr>
                     <a:graphicFrameLocks noChangeAspect="1"/>
@@ -4458,7 +5498,7 @@
                     <a:graphicData uri="http://schemas.openxmlformats.org/drawingml/2006/picture">
                       <pic:pic>
                         <pic:nvPicPr>
-                          <pic:cNvPr id="0" name="746e47f8e063e3bd.png"/>
+                          <pic:cNvPr id="0" name="104b03f6fcf7c233.png"/>
                           <pic:cNvPicPr/>
                         </pic:nvPicPr>
                         <pic:blipFill>
@@ -4470,7 +5510,7 @@
                         <pic:spPr>
                           <a:xfrm>
                             <a:off x="0" y="0"/>
-                            <a:ext cx="2772554" cy="344166"/>
+                            <a:ext cx="3426604" cy="406469"/>
                           </a:xfrm>
                           <a:prstGeom prst="rect"/>
                         </pic:spPr>
@@ -4799,12 +5839,59 @@
               </w:rPr>
               <w:t xml:space="preserve"> </w:t>
             </w:r>
-            <w:r>
-              <w:rPr>
-                <w:rtl/>
-              </w:rPr>
-              <w:t xml:space="preserve">‎$a=\dfrac{580-525}2=\RR{27{,}5}$</w:t>
-            </w:r>
+            <m:oMath>
+              <m:r>
+                <m:t>a</m:t>
+              </m:r>
+              <m:r>
+                <m:rPr>
+                  <m:sty m:val="p"/>
+                </m:rPr>
+                <m:t>=</m:t>
+              </m:r>
+              <m:f>
+                <m:fPr>
+                  <m:type m:val="bar"/>
+                </m:fPr>
+                <m:num>
+                  <m:r>
+                    <m:t>580</m:t>
+                  </m:r>
+                  <m:r>
+                    <m:rPr>
+                      <m:sty m:val="p"/>
+                    </m:rPr>
+                    <m:t>−</m:t>
+                  </m:r>
+                  <m:r>
+                    <m:t>525</m:t>
+                  </m:r>
+                </m:num>
+                <m:den>
+                  <m:r>
+                    <m:t>2</m:t>
+                  </m:r>
+                </m:den>
+              </m:f>
+              <m:r>
+                <m:rPr>
+                  <m:sty m:val="p"/>
+                </m:rPr>
+                <m:t>=</m:t>
+              </m:r>
+              <m:r>
+                <m:t>27</m:t>
+              </m:r>
+              <m:r>
+                <m:rPr>
+                  <m:sty m:val="p"/>
+                </m:rPr>
+                <m:t>,</m:t>
+              </m:r>
+              <m:r>
+                <m:t>5</m:t>
+              </m:r>
+            </m:oMath>
             <w:r>
               <w:rPr>
                 <w:rtl/>
@@ -4823,12 +5910,65 @@
               </w:rPr>
               <w:t xml:space="preserve"> </w:t>
             </w:r>
-            <w:r>
-              <w:rPr>
-                <w:rtl/>
-              </w:rPr>
-              <w:t xml:space="preserve">‎$b=175-27{,}5\times3=\RR{92{,}5}$</w:t>
-            </w:r>
+            <m:oMath>
+              <m:r>
+                <m:t>b</m:t>
+              </m:r>
+              <m:r>
+                <m:rPr>
+                  <m:sty m:val="p"/>
+                </m:rPr>
+                <m:t>=</m:t>
+              </m:r>
+              <m:r>
+                <m:t>175</m:t>
+              </m:r>
+              <m:r>
+                <m:rPr>
+                  <m:sty m:val="p"/>
+                </m:rPr>
+                <m:t>−</m:t>
+              </m:r>
+              <m:r>
+                <m:t>27</m:t>
+              </m:r>
+              <m:r>
+                <m:rPr>
+                  <m:sty m:val="p"/>
+                </m:rPr>
+                <m:t>,</m:t>
+              </m:r>
+              <m:r>
+                <m:t>5</m:t>
+              </m:r>
+              <m:r>
+                <m:rPr>
+                  <m:sty m:val="p"/>
+                </m:rPr>
+                <m:t>×</m:t>
+              </m:r>
+              <m:r>
+                <m:t>3</m:t>
+              </m:r>
+              <m:r>
+                <m:rPr>
+                  <m:sty m:val="p"/>
+                </m:rPr>
+                <m:t>=</m:t>
+              </m:r>
+              <m:r>
+                <m:t>92</m:t>
+              </m:r>
+              <m:r>
+                <m:rPr>
+                  <m:sty m:val="p"/>
+                </m:rPr>
+                <m:t>,</m:t>
+              </m:r>
+              <m:r>
+                <m:t>5</m:t>
+              </m:r>
+            </m:oMath>
             <w:r>
               <w:rPr>
                 <w:rtl/>
@@ -4841,12 +5981,50 @@
               </w:rPr>
               <w:t xml:space="preserve"> </w:t>
             </w:r>
-            <w:r>
-              <w:rPr>
-                <w:rtl/>
-              </w:rPr>
-              <w:t xml:space="preserve">‎$\RR{y=27{,}5x+92{,}5}$</w:t>
-            </w:r>
+            <m:oMath>
+              <m:r>
+                <m:t>y</m:t>
+              </m:r>
+              <m:r>
+                <m:rPr>
+                  <m:sty m:val="p"/>
+                </m:rPr>
+                <m:t>=</m:t>
+              </m:r>
+              <m:r>
+                <m:t>27</m:t>
+              </m:r>
+              <m:r>
+                <m:rPr>
+                  <m:sty m:val="p"/>
+                </m:rPr>
+                <m:t>,</m:t>
+              </m:r>
+              <m:r>
+                <m:t>5</m:t>
+              </m:r>
+              <m:r>
+                <m:t>x</m:t>
+              </m:r>
+              <m:r>
+                <m:rPr>
+                  <m:sty m:val="p"/>
+                </m:rPr>
+                <m:t>+</m:t>
+              </m:r>
+              <m:r>
+                <m:t>92</m:t>
+              </m:r>
+              <m:r>
+                <m:rPr>
+                  <m:sty m:val="p"/>
+                </m:rPr>
+                <m:t>,</m:t>
+              </m:r>
+              <m:r>
+                <m:t>5</m:t>
+              </m:r>
+            </m:oMath>
             <w:r>
               <w:rPr>
                 <w:rtl/>
@@ -4865,7 +6043,7 @@
               </w:rPr>
               <w:drawing>
                 <wp:inline>
-                  <wp:extent cx="2772554" cy="1423081"/>
+                  <wp:extent cx="3099816" cy="1591056"/>
                   <wp:docPr id="6" name="Picture 6"/>
                   <wp:cNvGraphicFramePr>
                     <a:graphicFrameLocks noChangeAspect="1"/>
@@ -4874,7 +6052,7 @@
                     <a:graphicData uri="http://schemas.openxmlformats.org/drawingml/2006/picture">
                       <pic:pic>
                         <pic:nvPicPr>
-                          <pic:cNvPr id="0" name="ae7a43b616f15c8d.png"/>
+                          <pic:cNvPr id="0" name="941a40ca4794bebb.png"/>
                           <pic:cNvPicPr/>
                         </pic:nvPicPr>
                         <pic:blipFill>
@@ -4886,7 +6064,7 @@
                         <pic:spPr>
                           <a:xfrm>
                             <a:off x="0" y="0"/>
-                            <a:ext cx="2772554" cy="1423081"/>
+                            <a:ext cx="3099816" cy="1591056"/>
                           </a:xfrm>
                           <a:prstGeom prst="rect"/>
                         </pic:spPr>
@@ -5192,7 +6370,7 @@
               </w:rPr>
               <w:drawing>
                 <wp:inline>
-                  <wp:extent cx="2772554" cy="174967"/>
+                  <wp:extent cx="3426604" cy="206641"/>
                   <wp:docPr id="7" name="Picture 7"/>
                   <wp:cNvGraphicFramePr>
                     <a:graphicFrameLocks noChangeAspect="1"/>
@@ -5201,7 +6379,7 @@
                     <a:graphicData uri="http://schemas.openxmlformats.org/drawingml/2006/picture">
                       <pic:pic>
                         <pic:nvPicPr>
-                          <pic:cNvPr id="0" name="0a1956bb23c86db4.png"/>
+                          <pic:cNvPr id="0" name="458397ea2769ddc9.png"/>
                           <pic:cNvPicPr/>
                         </pic:nvPicPr>
                         <pic:blipFill>
@@ -5213,7 +6391,7 @@
                         <pic:spPr>
                           <a:xfrm>
                             <a:off x="0" y="0"/>
-                            <a:ext cx="2772554" cy="174967"/>
+                            <a:ext cx="3426604" cy="206641"/>
                           </a:xfrm>
                           <a:prstGeom prst="rect"/>
                         </pic:spPr>
@@ -5446,12 +6624,36 @@
               </w:rPr>
               <w:t xml:space="preserve"> </w:t>
             </w:r>
-            <w:r>
-              <w:rPr>
-                <w:rtl/>
-              </w:rPr>
-              <w:t xml:space="preserve">‎$\bar x=\RR{3{,}5}$</w:t>
-            </w:r>
+            <m:oMath>
+              <m:acc>
+                <m:accPr>
+                  <m:chr m:val="‾"/>
+                </m:accPr>
+                <m:e>
+                  <m:r>
+                    <m:t>x</m:t>
+                  </m:r>
+                </m:e>
+              </m:acc>
+              <m:r>
+                <m:rPr>
+                  <m:sty m:val="p"/>
+                </m:rPr>
+                <m:t>=</m:t>
+              </m:r>
+              <m:r>
+                <m:t>3</m:t>
+              </m:r>
+              <m:r>
+                <m:rPr>
+                  <m:sty m:val="p"/>
+                </m:rPr>
+                <m:t>,</m:t>
+              </m:r>
+              <m:r>
+                <m:t>5</m:t>
+              </m:r>
+            </m:oMath>
             <w:r>
               <w:rPr>
                 <w:rtl/>
@@ -5470,12 +6672,66 @@
               </w:rPr>
               <w:t xml:space="preserve"> </w:t>
             </w:r>
-            <w:r>
-              <w:rPr>
-                <w:rtl/>
-              </w:rPr>
-              <w:t xml:space="preserve">‎$\bar y=\dfrac{18{,}6}6=\RR{3{,}1}$</w:t>
-            </w:r>
+            <m:oMath>
+              <m:acc>
+                <m:accPr>
+                  <m:chr m:val="‾"/>
+                </m:accPr>
+                <m:e>
+                  <m:r>
+                    <m:t>y</m:t>
+                  </m:r>
+                </m:e>
+              </m:acc>
+              <m:r>
+                <m:rPr>
+                  <m:sty m:val="p"/>
+                </m:rPr>
+                <m:t>=</m:t>
+              </m:r>
+              <m:f>
+                <m:fPr>
+                  <m:type m:val="bar"/>
+                </m:fPr>
+                <m:num>
+                  <m:r>
+                    <m:t>18</m:t>
+                  </m:r>
+                  <m:r>
+                    <m:rPr>
+                      <m:sty m:val="p"/>
+                    </m:rPr>
+                    <m:t>,</m:t>
+                  </m:r>
+                  <m:r>
+                    <m:t>6</m:t>
+                  </m:r>
+                </m:num>
+                <m:den>
+                  <m:r>
+                    <m:t>6</m:t>
+                  </m:r>
+                </m:den>
+              </m:f>
+              <m:r>
+                <m:rPr>
+                  <m:sty m:val="p"/>
+                </m:rPr>
+                <m:t>=</m:t>
+              </m:r>
+              <m:r>
+                <m:t>3</m:t>
+              </m:r>
+              <m:r>
+                <m:rPr>
+                  <m:sty m:val="p"/>
+                </m:rPr>
+                <m:t>,</m:t>
+              </m:r>
+              <m:r>
+                <m:t>1</m:t>
+              </m:r>
+            </m:oMath>
             <w:r>
               <w:rPr>
                 <w:rtl/>
@@ -5745,12 +7001,104 @@
               <w:bidi/>
               <w:jc w:val="left"/>
             </w:pPr>
-            <w:r>
-              <w:rPr>
-                <w:rtl/>
-              </w:rPr>
-              <w:t xml:space="preserve">‎$a=\dfrac{12{,}033-3{,}5\times3{,}1}{2{,}917}\approx\RR{0{,}406}$</w:t>
-            </w:r>
+            <m:oMath>
+              <m:r>
+                <m:t>a</m:t>
+              </m:r>
+              <m:r>
+                <m:rPr>
+                  <m:sty m:val="p"/>
+                </m:rPr>
+                <m:t>=</m:t>
+              </m:r>
+              <m:f>
+                <m:fPr>
+                  <m:type m:val="bar"/>
+                </m:fPr>
+                <m:num>
+                  <m:r>
+                    <m:t>12</m:t>
+                  </m:r>
+                  <m:r>
+                    <m:rPr>
+                      <m:sty m:val="p"/>
+                    </m:rPr>
+                    <m:t>,</m:t>
+                  </m:r>
+                  <m:r>
+                    <m:t>033</m:t>
+                  </m:r>
+                  <m:r>
+                    <m:rPr>
+                      <m:sty m:val="p"/>
+                    </m:rPr>
+                    <m:t>−</m:t>
+                  </m:r>
+                  <m:r>
+                    <m:t>3</m:t>
+                  </m:r>
+                  <m:r>
+                    <m:rPr>
+                      <m:sty m:val="p"/>
+                    </m:rPr>
+                    <m:t>,</m:t>
+                  </m:r>
+                  <m:r>
+                    <m:t>5</m:t>
+                  </m:r>
+                  <m:r>
+                    <m:rPr>
+                      <m:sty m:val="p"/>
+                    </m:rPr>
+                    <m:t>×</m:t>
+                  </m:r>
+                  <m:r>
+                    <m:t>3</m:t>
+                  </m:r>
+                  <m:r>
+                    <m:rPr>
+                      <m:sty m:val="p"/>
+                    </m:rPr>
+                    <m:t>,</m:t>
+                  </m:r>
+                  <m:r>
+                    <m:t>1</m:t>
+                  </m:r>
+                </m:num>
+                <m:den>
+                  <m:r>
+                    <m:t>2</m:t>
+                  </m:r>
+                  <m:r>
+                    <m:rPr>
+                      <m:sty m:val="p"/>
+                    </m:rPr>
+                    <m:t>,</m:t>
+                  </m:r>
+                  <m:r>
+                    <m:t>917</m:t>
+                  </m:r>
+                </m:den>
+              </m:f>
+              <m:r>
+                <m:rPr>
+                  <m:sty m:val="p"/>
+                </m:rPr>
+                <m:t>≈</m:t>
+              </m:r>
+              <m:r>
+                <m:t>0</m:t>
+              </m:r>
+              <m:r>
+                <m:rPr>
+                  <m:sty m:val="p"/>
+                </m:rPr>
+                <m:t>,</m:t>
+              </m:r>
+              <m:r>
+                <m:t>406</m:t>
+              </m:r>
+            </m:oMath>
             <w:r>
               <w:rPr>
                 <w:rtl/>
@@ -5769,12 +7117,83 @@
               </w:rPr>
               <w:t xml:space="preserve"> </w:t>
             </w:r>
-            <w:r>
-              <w:rPr>
-                <w:rtl/>
-              </w:rPr>
-              <w:t xml:space="preserve">‎$b=3{,}1-0{,}406\times3{,}5\approx\RR{1{,}68}$</w:t>
-            </w:r>
+            <m:oMath>
+              <m:r>
+                <m:t>b</m:t>
+              </m:r>
+              <m:r>
+                <m:rPr>
+                  <m:sty m:val="p"/>
+                </m:rPr>
+                <m:t>=</m:t>
+              </m:r>
+              <m:r>
+                <m:t>3</m:t>
+              </m:r>
+              <m:r>
+                <m:rPr>
+                  <m:sty m:val="p"/>
+                </m:rPr>
+                <m:t>,</m:t>
+              </m:r>
+              <m:r>
+                <m:t>1</m:t>
+              </m:r>
+              <m:r>
+                <m:rPr>
+                  <m:sty m:val="p"/>
+                </m:rPr>
+                <m:t>−</m:t>
+              </m:r>
+              <m:r>
+                <m:t>0</m:t>
+              </m:r>
+              <m:r>
+                <m:rPr>
+                  <m:sty m:val="p"/>
+                </m:rPr>
+                <m:t>,</m:t>
+              </m:r>
+              <m:r>
+                <m:t>406</m:t>
+              </m:r>
+              <m:r>
+                <m:rPr>
+                  <m:sty m:val="p"/>
+                </m:rPr>
+                <m:t>×</m:t>
+              </m:r>
+              <m:r>
+                <m:t>3</m:t>
+              </m:r>
+              <m:r>
+                <m:rPr>
+                  <m:sty m:val="p"/>
+                </m:rPr>
+                <m:t>,</m:t>
+              </m:r>
+              <m:r>
+                <m:t>5</m:t>
+              </m:r>
+              <m:r>
+                <m:rPr>
+                  <m:sty m:val="p"/>
+                </m:rPr>
+                <m:t>≈</m:t>
+              </m:r>
+              <m:r>
+                <m:t>1</m:t>
+              </m:r>
+              <m:r>
+                <m:rPr>
+                  <m:sty m:val="p"/>
+                </m:rPr>
+                <m:t>,</m:t>
+              </m:r>
+              <m:r>
+                <m:t>68</m:t>
+              </m:r>
+            </m:oMath>
             <w:r>
               <w:rPr>
                 <w:rtl/>
@@ -5787,12 +7206,50 @@
               </w:rPr>
               <w:t xml:space="preserve"> </w:t>
             </w:r>
-            <w:r>
-              <w:rPr>
-                <w:rtl/>
-              </w:rPr>
-              <w:t xml:space="preserve">‎$\RR{y=0{,}406x+1{,}68}$</w:t>
-            </w:r>
+            <m:oMath>
+              <m:r>
+                <m:t>y</m:t>
+              </m:r>
+              <m:r>
+                <m:rPr>
+                  <m:sty m:val="p"/>
+                </m:rPr>
+                <m:t>=</m:t>
+              </m:r>
+              <m:r>
+                <m:t>0</m:t>
+              </m:r>
+              <m:r>
+                <m:rPr>
+                  <m:sty m:val="p"/>
+                </m:rPr>
+                <m:t>,</m:t>
+              </m:r>
+              <m:r>
+                <m:t>406</m:t>
+              </m:r>
+              <m:r>
+                <m:t>x</m:t>
+              </m:r>
+              <m:r>
+                <m:rPr>
+                  <m:sty m:val="p"/>
+                </m:rPr>
+                <m:t>+</m:t>
+              </m:r>
+              <m:r>
+                <m:t>1</m:t>
+              </m:r>
+              <m:r>
+                <m:rPr>
+                  <m:sty m:val="p"/>
+                </m:rPr>
+                <m:t>,</m:t>
+              </m:r>
+              <m:r>
+                <m:t>68</m:t>
+              </m:r>
+            </m:oMath>
             <w:r>
               <w:rPr>
                 <w:rtl/>
@@ -6470,7 +7927,7 @@
     <w:tbl>
       <w:tblPr>
         <w:tblStyle w:val="Table"/>
-        <w:tblW w:w="7681" w:type="dxa"/>
+        <w:tblW w:w="9864" w:type="dxa"/>
         <w:jc w:val="center"/>
         <w:tblBorders>
           <w:top w:val="single" w:sz="4" w:space="0" w:color="000000"/>
@@ -6483,10 +7940,10 @@
         <w:tblLook w:firstRow="0" w:lastRow="0" w:firstColumn="0" w:lastColumn="0" w:noHBand="0" w:noVBand="0" w:val="0000"/>
       </w:tblPr>
       <w:tblGrid>
-        <w:gridCol w:w="1188"/>
-        <w:gridCol w:w="712"/>
-        <w:gridCol w:w="4593"/>
-        <w:gridCol w:w="1188"/>
+        <w:gridCol w:w="1084"/>
+        <w:gridCol w:w="591"/>
+        <w:gridCol w:w="7004"/>
+        <w:gridCol w:w="1183"/>
       </w:tblGrid>
       <w:tr>
         <w:tc>
@@ -6968,12 +8425,65 @@
               </w:rPr>
               <w:t xml:space="preserve"> </w:t>
             </w:r>
-            <w:r>
-              <w:rPr>
-                <w:rtl/>
-              </w:rPr>
-              <w:t xml:space="preserve">‎$y=27{,}5\times7+92{,}5=\RR{285}$</w:t>
-            </w:r>
+            <m:oMath>
+              <m:r>
+                <m:t>y</m:t>
+              </m:r>
+              <m:r>
+                <m:rPr>
+                  <m:sty m:val="p"/>
+                </m:rPr>
+                <m:t>=</m:t>
+              </m:r>
+              <m:r>
+                <m:t>27</m:t>
+              </m:r>
+              <m:r>
+                <m:rPr>
+                  <m:sty m:val="p"/>
+                </m:rPr>
+                <m:t>,</m:t>
+              </m:r>
+              <m:r>
+                <m:t>5</m:t>
+              </m:r>
+              <m:r>
+                <m:rPr>
+                  <m:sty m:val="p"/>
+                </m:rPr>
+                <m:t>×</m:t>
+              </m:r>
+              <m:r>
+                <m:t>7</m:t>
+              </m:r>
+              <m:r>
+                <m:rPr>
+                  <m:sty m:val="p"/>
+                </m:rPr>
+                <m:t>+</m:t>
+              </m:r>
+              <m:r>
+                <m:t>92</m:t>
+              </m:r>
+              <m:r>
+                <m:rPr>
+                  <m:sty m:val="p"/>
+                </m:rPr>
+                <m:t>,</m:t>
+              </m:r>
+              <m:r>
+                <m:t>5</m:t>
+              </m:r>
+              <m:r>
+                <m:rPr>
+                  <m:sty m:val="p"/>
+                </m:rPr>
+                <m:t>=</m:t>
+              </m:r>
+              <m:r>
+                <m:t>285</m:t>
+              </m:r>
+            </m:oMath>
             <w:r>
               <w:rPr>
                 <w:rtl/>
@@ -7026,12 +8536,83 @@
               </w:rPr>
               <w:t xml:space="preserve"> </w:t>
             </w:r>
-            <w:r>
-              <w:rPr>
-                <w:rtl/>
-              </w:rPr>
-              <w:t xml:space="preserve">‎$y=27{,}5\times2{,}5+92{,}5=\RR{161{,}25}$</w:t>
-            </w:r>
+            <m:oMath>
+              <m:r>
+                <m:t>y</m:t>
+              </m:r>
+              <m:r>
+                <m:rPr>
+                  <m:sty m:val="p"/>
+                </m:rPr>
+                <m:t>=</m:t>
+              </m:r>
+              <m:r>
+                <m:t>27</m:t>
+              </m:r>
+              <m:r>
+                <m:rPr>
+                  <m:sty m:val="p"/>
+                </m:rPr>
+                <m:t>,</m:t>
+              </m:r>
+              <m:r>
+                <m:t>5</m:t>
+              </m:r>
+              <m:r>
+                <m:rPr>
+                  <m:sty m:val="p"/>
+                </m:rPr>
+                <m:t>×</m:t>
+              </m:r>
+              <m:r>
+                <m:t>2</m:t>
+              </m:r>
+              <m:r>
+                <m:rPr>
+                  <m:sty m:val="p"/>
+                </m:rPr>
+                <m:t>,</m:t>
+              </m:r>
+              <m:r>
+                <m:t>5</m:t>
+              </m:r>
+              <m:r>
+                <m:rPr>
+                  <m:sty m:val="p"/>
+                </m:rPr>
+                <m:t>+</m:t>
+              </m:r>
+              <m:r>
+                <m:t>92</m:t>
+              </m:r>
+              <m:r>
+                <m:rPr>
+                  <m:sty m:val="p"/>
+                </m:rPr>
+                <m:t>,</m:t>
+              </m:r>
+              <m:r>
+                <m:t>5</m:t>
+              </m:r>
+              <m:r>
+                <m:rPr>
+                  <m:sty m:val="p"/>
+                </m:rPr>
+                <m:t>=</m:t>
+              </m:r>
+              <m:r>
+                <m:t>161</m:t>
+              </m:r>
+              <m:r>
+                <m:rPr>
+                  <m:sty m:val="p"/>
+                </m:rPr>
+                <m:t>,</m:t>
+              </m:r>
+              <m:r>
+                <m:t>25</m:t>
+              </m:r>
+            </m:oMath>
             <w:r>
               <w:rPr>
                 <w:rtl/>
@@ -7443,12 +9024,77 @@
               </w:rPr>
               <w:t xml:space="preserve"> </w:t>
             </w:r>
-            <w:r>
-              <w:rPr>
-                <w:rtl/>
-              </w:rPr>
-              <w:t xml:space="preserve">‎$\RR{y=e^{ax+b}=e^b\,e^{ax}}$</w:t>
-            </w:r>
+            <m:oMath>
+              <m:r>
+                <m:t>y</m:t>
+              </m:r>
+              <m:r>
+                <m:rPr>
+                  <m:sty m:val="p"/>
+                </m:rPr>
+                <m:t>=</m:t>
+              </m:r>
+              <m:sSup>
+                <m:e>
+                  <m:r>
+                    <m:t>e</m:t>
+                  </m:r>
+                </m:e>
+                <m:sup>
+                  <m:r>
+                    <m:t>a</m:t>
+                  </m:r>
+                  <m:r>
+                    <m:t>x</m:t>
+                  </m:r>
+                  <m:r>
+                    <m:rPr>
+                      <m:sty m:val="p"/>
+                    </m:rPr>
+                    <m:t>+</m:t>
+                  </m:r>
+                  <m:r>
+                    <m:t>b</m:t>
+                  </m:r>
+                </m:sup>
+              </m:sSup>
+              <m:r>
+                <m:rPr>
+                  <m:sty m:val="p"/>
+                </m:rPr>
+                <m:t>=</m:t>
+              </m:r>
+              <m:sSup>
+                <m:e>
+                  <m:r>
+                    <m:t>e</m:t>
+                  </m:r>
+                </m:e>
+                <m:sup>
+                  <m:r>
+                    <m:t>b</m:t>
+                  </m:r>
+                </m:sup>
+              </m:sSup>
+              <m:r>
+                <m:t> </m:t>
+              </m:r>
+              <m:sSup>
+                <m:e>
+                  <m:r>
+                    <m:t>e</m:t>
+                  </m:r>
+                </m:e>
+                <m:sup>
+                  <m:r>
+                    <m:t>a</m:t>
+                  </m:r>
+                  <m:r>
+                    <m:t>x</m:t>
+                  </m:r>
+                </m:sup>
+              </m:sSup>
+            </m:oMath>
             <w:r>
               <w:rPr>
                 <w:rtl/>
@@ -7530,7 +9176,7 @@
               </w:rPr>
               <w:drawing>
                 <wp:inline>
-                  <wp:extent cx="2772554" cy="255721"/>
+                  <wp:extent cx="3426604" cy="302013"/>
                   <wp:docPr id="8" name="Picture 8"/>
                   <wp:cNvGraphicFramePr>
                     <a:graphicFrameLocks noChangeAspect="1"/>
@@ -7539,7 +9185,7 @@
                     <a:graphicData uri="http://schemas.openxmlformats.org/drawingml/2006/picture">
                       <pic:pic>
                         <pic:nvPicPr>
-                          <pic:cNvPr id="0" name="efd5d20cb732578b.png"/>
+                          <pic:cNvPr id="0" name="0520ac441267d16e.png"/>
                           <pic:cNvPicPr/>
                         </pic:nvPicPr>
                         <pic:blipFill>
@@ -7551,7 +9197,7 @@
                         <pic:spPr>
                           <a:xfrm>
                             <a:off x="0" y="0"/>
-                            <a:ext cx="2772554" cy="255721"/>
+                            <a:ext cx="3426604" cy="302013"/>
                           </a:xfrm>
                           <a:prstGeom prst="rect"/>
                         </pic:spPr>
@@ -7629,12 +9275,50 @@
               </w:rPr>
               <w:t xml:space="preserve"> </w:t>
             </w:r>
-            <w:r>
-              <w:rPr>
-                <w:rtl/>
-              </w:rPr>
-              <w:t xml:space="preserve">‎$\RR{y\approx19{,}03x+24{,}73}$</w:t>
-            </w:r>
+            <m:oMath>
+              <m:r>
+                <m:t>y</m:t>
+              </m:r>
+              <m:r>
+                <m:rPr>
+                  <m:sty m:val="p"/>
+                </m:rPr>
+                <m:t>≈</m:t>
+              </m:r>
+              <m:r>
+                <m:t>19</m:t>
+              </m:r>
+              <m:r>
+                <m:rPr>
+                  <m:sty m:val="p"/>
+                </m:rPr>
+                <m:t>,</m:t>
+              </m:r>
+              <m:r>
+                <m:t>03</m:t>
+              </m:r>
+              <m:r>
+                <m:t>x</m:t>
+              </m:r>
+              <m:r>
+                <m:rPr>
+                  <m:sty m:val="p"/>
+                </m:rPr>
+                <m:t>+</m:t>
+              </m:r>
+              <m:r>
+                <m:t>24</m:t>
+              </m:r>
+              <m:r>
+                <m:rPr>
+                  <m:sty m:val="p"/>
+                </m:rPr>
+                <m:t>,</m:t>
+              </m:r>
+              <m:r>
+                <m:t>73</m:t>
+              </m:r>
+            </m:oMath>
             <w:r>
               <w:rPr>
                 <w:rtl/>
@@ -7771,12 +9455,107 @@
               </w:rPr>
               <w:t xml:space="preserve"> </w:t>
             </w:r>
-            <w:r>
-              <w:rPr>
-                <w:rtl/>
-              </w:rPr>
-              <w:t xml:space="preserve">‎$y\approx e^{3{,}699}e^{0{,}214x}\approx\RR{40{,}4\,e^{0{,}214x}}$</w:t>
-            </w:r>
+            <m:oMath>
+              <m:r>
+                <m:t>y</m:t>
+              </m:r>
+              <m:r>
+                <m:rPr>
+                  <m:sty m:val="p"/>
+                </m:rPr>
+                <m:t>≈</m:t>
+              </m:r>
+              <m:sSup>
+                <m:e>
+                  <m:r>
+                    <m:t>e</m:t>
+                  </m:r>
+                </m:e>
+                <m:sup>
+                  <m:r>
+                    <m:t>3</m:t>
+                  </m:r>
+                  <m:r>
+                    <m:rPr>
+                      <m:sty m:val="p"/>
+                    </m:rPr>
+                    <m:t>,</m:t>
+                  </m:r>
+                  <m:r>
+                    <m:t>699</m:t>
+                  </m:r>
+                </m:sup>
+              </m:sSup>
+              <m:sSup>
+                <m:e>
+                  <m:r>
+                    <m:t>e</m:t>
+                  </m:r>
+                </m:e>
+                <m:sup>
+                  <m:r>
+                    <m:t>0</m:t>
+                  </m:r>
+                  <m:r>
+                    <m:rPr>
+                      <m:sty m:val="p"/>
+                    </m:rPr>
+                    <m:t>,</m:t>
+                  </m:r>
+                  <m:r>
+                    <m:t>214</m:t>
+                  </m:r>
+                  <m:r>
+                    <m:t>x</m:t>
+                  </m:r>
+                </m:sup>
+              </m:sSup>
+              <m:r>
+                <m:rPr>
+                  <m:sty m:val="p"/>
+                </m:rPr>
+                <m:t>≈</m:t>
+              </m:r>
+              <m:r>
+                <m:t>40</m:t>
+              </m:r>
+              <m:r>
+                <m:rPr>
+                  <m:sty m:val="p"/>
+                </m:rPr>
+                <m:t>,</m:t>
+              </m:r>
+              <m:r>
+                <m:t>4</m:t>
+              </m:r>
+              <m:r>
+                <m:t> </m:t>
+              </m:r>
+              <m:sSup>
+                <m:e>
+                  <m:r>
+                    <m:t>e</m:t>
+                  </m:r>
+                </m:e>
+                <m:sup>
+                  <m:r>
+                    <m:t>0</m:t>
+                  </m:r>
+                  <m:r>
+                    <m:rPr>
+                      <m:sty m:val="p"/>
+                    </m:rPr>
+                    <m:t>,</m:t>
+                  </m:r>
+                  <m:r>
+                    <m:t>214</m:t>
+                  </m:r>
+                  <m:r>
+                    <m:t>x</m:t>
+                  </m:r>
+                </m:sup>
+              </m:sSup>
+            </m:oMath>
             <w:r>
               <w:rPr>
                 <w:rtl/>
@@ -7841,12 +9620,56 @@
               </w:rPr>
               <w:t xml:space="preserve"> </w:t>
             </w:r>
-            <w:r>
-              <w:rPr>
-                <w:rtl/>
-              </w:rPr>
-              <w:t xml:space="preserve">‎$19{,}03\times8+24{,}73\approx\RR{177}$</w:t>
-            </w:r>
+            <m:oMath>
+              <m:r>
+                <m:t>19</m:t>
+              </m:r>
+              <m:r>
+                <m:rPr>
+                  <m:sty m:val="p"/>
+                </m:rPr>
+                <m:t>,</m:t>
+              </m:r>
+              <m:r>
+                <m:t>03</m:t>
+              </m:r>
+              <m:r>
+                <m:rPr>
+                  <m:sty m:val="p"/>
+                </m:rPr>
+                <m:t>×</m:t>
+              </m:r>
+              <m:r>
+                <m:t>8</m:t>
+              </m:r>
+              <m:r>
+                <m:rPr>
+                  <m:sty m:val="p"/>
+                </m:rPr>
+                <m:t>+</m:t>
+              </m:r>
+              <m:r>
+                <m:t>24</m:t>
+              </m:r>
+              <m:r>
+                <m:rPr>
+                  <m:sty m:val="p"/>
+                </m:rPr>
+                <m:t>,</m:t>
+              </m:r>
+              <m:r>
+                <m:t>73</m:t>
+              </m:r>
+              <m:r>
+                <m:rPr>
+                  <m:sty m:val="p"/>
+                </m:rPr>
+                <m:t>≈</m:t>
+              </m:r>
+              <m:r>
+                <m:t>177</m:t>
+              </m:r>
+            </m:oMath>
             <w:r>
               <w:rPr>
                 <w:rtl/>
@@ -7865,12 +9688,92 @@
               </w:rPr>
               <w:t xml:space="preserve"> </w:t>
             </w:r>
-            <w:r>
-              <w:rPr>
-                <w:rtl/>
-              </w:rPr>
-              <w:t xml:space="preserve">‎$e^{0{,}214\times8+3{,}699}=e^{5{,}411}\approx\RR{224}$</w:t>
-            </w:r>
+            <m:oMath>
+              <m:sSup>
+                <m:e>
+                  <m:r>
+                    <m:t>e</m:t>
+                  </m:r>
+                </m:e>
+                <m:sup>
+                  <m:r>
+                    <m:t>0</m:t>
+                  </m:r>
+                  <m:r>
+                    <m:rPr>
+                      <m:sty m:val="p"/>
+                    </m:rPr>
+                    <m:t>,</m:t>
+                  </m:r>
+                  <m:r>
+                    <m:t>214</m:t>
+                  </m:r>
+                  <m:r>
+                    <m:rPr>
+                      <m:sty m:val="p"/>
+                    </m:rPr>
+                    <m:t>×</m:t>
+                  </m:r>
+                  <m:r>
+                    <m:t>8</m:t>
+                  </m:r>
+                  <m:r>
+                    <m:rPr>
+                      <m:sty m:val="p"/>
+                    </m:rPr>
+                    <m:t>+</m:t>
+                  </m:r>
+                  <m:r>
+                    <m:t>3</m:t>
+                  </m:r>
+                  <m:r>
+                    <m:rPr>
+                      <m:sty m:val="p"/>
+                    </m:rPr>
+                    <m:t>,</m:t>
+                  </m:r>
+                  <m:r>
+                    <m:t>699</m:t>
+                  </m:r>
+                </m:sup>
+              </m:sSup>
+              <m:r>
+                <m:rPr>
+                  <m:sty m:val="p"/>
+                </m:rPr>
+                <m:t>=</m:t>
+              </m:r>
+              <m:sSup>
+                <m:e>
+                  <m:r>
+                    <m:t>e</m:t>
+                  </m:r>
+                </m:e>
+                <m:sup>
+                  <m:r>
+                    <m:t>5</m:t>
+                  </m:r>
+                  <m:r>
+                    <m:rPr>
+                      <m:sty m:val="p"/>
+                    </m:rPr>
+                    <m:t>,</m:t>
+                  </m:r>
+                  <m:r>
+                    <m:t>411</m:t>
+                  </m:r>
+                </m:sup>
+              </m:sSup>
+              <m:r>
+                <m:rPr>
+                  <m:sty m:val="p"/>
+                </m:rPr>
+                <m:t>≈</m:t>
+              </m:r>
+              <m:r>
+                <m:t>224</m:t>
+              </m:r>
+            </m:oMath>
             <w:r>
               <w:rPr>
                 <w:rtl/>
@@ -7889,7 +9792,7 @@
               </w:rPr>
               <w:drawing>
                 <wp:inline>
-                  <wp:extent cx="2772554" cy="2099802"/>
+                  <wp:extent cx="3108959" cy="2354579"/>
                   <wp:docPr id="9" name="Picture 9"/>
                   <wp:cNvGraphicFramePr>
                     <a:graphicFrameLocks noChangeAspect="1"/>
@@ -7898,7 +9801,7 @@
                     <a:graphicData uri="http://schemas.openxmlformats.org/drawingml/2006/picture">
                       <pic:pic>
                         <pic:nvPicPr>
-                          <pic:cNvPr id="0" name="1683e66f6da64b3c.png"/>
+                          <pic:cNvPr id="0" name="d2fd1a59d975140a.png"/>
                           <pic:cNvPicPr/>
                         </pic:nvPicPr>
                         <pic:blipFill>
@@ -7910,7 +9813,7 @@
                         <pic:spPr>
                           <a:xfrm>
                             <a:off x="0" y="0"/>
-                            <a:ext cx="2772554" cy="2099802"/>
+                            <a:ext cx="3108959" cy="2354579"/>
                           </a:xfrm>
                           <a:prstGeom prst="rect"/>
                         </pic:spPr>
@@ -7930,7 +9833,49 @@
               <w:rPr>
                 <w:rtl/>
               </w:rPr>
-              <w:t xml:space="preserve">النقط تتبع المنحنى الأسي أحسن: .</w:t>
+              <w:t xml:space="preserve">النقط تتبع المنحنى الأسي أحسن:</w:t>
+            </w:r>
+            <w:r>
+              <w:rPr>
+                <w:rtl/>
+              </w:rPr>
+              <w:t xml:space="preserve"> </w:t>
+            </w:r>
+            <w:r>
+              <w:rPr>
+                <w:rtl/>
+              </w:rPr>
+              <w:t xml:space="preserve">التعديل</w:t>
+            </w:r>
+            <w:r>
+              <w:rPr>
+                <w:rtl/>
+              </w:rPr>
+              <w:t xml:space="preserve"> </w:t>
+            </w:r>
+            <w:r>
+              <w:rPr>
+                <w:rtl/>
+              </w:rPr>
+              <w:t xml:space="preserve">الأسي</w:t>
+            </w:r>
+            <w:r>
+              <w:rPr>
+                <w:rtl/>
+              </w:rPr>
+              <w:t xml:space="preserve"> </w:t>
+            </w:r>
+            <w:r>
+              <w:rPr>
+                <w:rtl/>
+              </w:rPr>
+              <w:t xml:space="preserve">أنسب</w:t>
+            </w:r>
+            <w:r>
+              <w:rPr>
+                <w:rtl/>
+              </w:rPr>
+              <w:t xml:space="preserve">.</w:t>
             </w:r>
           </w:p>
         </w:tc>
@@ -8287,12 +10232,65 @@
               </w:rPr>
               <w:t xml:space="preserve"> </w:t>
             </w:r>
-            <w:r>
-              <w:rPr>
-                <w:rtl/>
-              </w:rPr>
-              <w:t xml:space="preserve">‎$0{,}406\times8+1{,}68\approx\RR{4{,}93}$</w:t>
-            </w:r>
+            <m:oMath>
+              <m:r>
+                <m:t>0</m:t>
+              </m:r>
+              <m:r>
+                <m:rPr>
+                  <m:sty m:val="p"/>
+                </m:rPr>
+                <m:t>,</m:t>
+              </m:r>
+              <m:r>
+                <m:t>406</m:t>
+              </m:r>
+              <m:r>
+                <m:rPr>
+                  <m:sty m:val="p"/>
+                </m:rPr>
+                <m:t>×</m:t>
+              </m:r>
+              <m:r>
+                <m:t>8</m:t>
+              </m:r>
+              <m:r>
+                <m:rPr>
+                  <m:sty m:val="p"/>
+                </m:rPr>
+                <m:t>+</m:t>
+              </m:r>
+              <m:r>
+                <m:t>1</m:t>
+              </m:r>
+              <m:r>
+                <m:rPr>
+                  <m:sty m:val="p"/>
+                </m:rPr>
+                <m:t>,</m:t>
+              </m:r>
+              <m:r>
+                <m:t>68</m:t>
+              </m:r>
+              <m:r>
+                <m:rPr>
+                  <m:sty m:val="p"/>
+                </m:rPr>
+                <m:t>≈</m:t>
+              </m:r>
+              <m:r>
+                <m:t>4</m:t>
+              </m:r>
+              <m:r>
+                <m:rPr>
+                  <m:sty m:val="p"/>
+                </m:rPr>
+                <m:t>,</m:t>
+              </m:r>
+              <m:r>
+                <m:t>93</m:t>
+              </m:r>
+            </m:oMath>
             <w:r>
               <w:rPr>
                 <w:rtl/>
@@ -8453,7 +10451,37 @@
               <w:rPr>
                 <w:rtl/>
               </w:rPr>
-              <w:t xml:space="preserve">: .</w:t>
+              <w:t xml:space="preserve">:</w:t>
+            </w:r>
+            <w:r>
+              <w:rPr>
+                <w:rtl/>
+              </w:rPr>
+              <w:t xml:space="preserve"> </w:t>
+            </w:r>
+            <w:r>
+              <w:rPr>
+                <w:rtl/>
+              </w:rPr>
+              <w:t xml:space="preserve">السنة</w:t>
+            </w:r>
+            <w:r>
+              <w:rPr>
+                <w:rtl/>
+              </w:rPr>
+              <w:t xml:space="preserve"> </w:t>
+            </w:r>
+            <w:r>
+              <w:rPr>
+                <w:rtl/>
+              </w:rPr>
+              <w:t xml:space="preserve">التاسعة</w:t>
+            </w:r>
+            <w:r>
+              <w:rPr>
+                <w:rtl/>
+              </w:rPr>
+              <w:t xml:space="preserve">.</w:t>
             </w:r>
           </w:p>
           <w:p>
@@ -8996,7 +11024,7 @@
     <w:tbl>
       <w:tblPr>
         <w:tblStyle w:val="Table"/>
-        <w:tblW w:w="7681" w:type="dxa"/>
+        <w:tblW w:w="9864" w:type="dxa"/>
         <w:jc w:val="center"/>
         <w:tblBorders>
           <w:top w:val="single" w:sz="4" w:space="0" w:color="000000"/>
@@ -9009,10 +11037,10 @@
         <w:tblLook w:firstRow="0" w:lastRow="0" w:firstColumn="0" w:lastColumn="0" w:noHBand="0" w:noVBand="0" w:val="0000"/>
       </w:tblPr>
       <w:tblGrid>
-        <w:gridCol w:w="1188"/>
-        <w:gridCol w:w="712"/>
-        <w:gridCol w:w="4593"/>
-        <w:gridCol w:w="1188"/>
+        <w:gridCol w:w="1084"/>
+        <w:gridCol w:w="591"/>
+        <w:gridCol w:w="7004"/>
+        <w:gridCol w:w="1183"/>
       </w:tblGrid>
       <w:tr>
         <w:tc>
@@ -9322,7 +11350,7 @@
               </w:rPr>
               <w:drawing>
                 <wp:inline>
-                  <wp:extent cx="2772554" cy="174967"/>
+                  <wp:extent cx="3426604" cy="206641"/>
                   <wp:docPr id="10" name="Picture 10"/>
                   <wp:cNvGraphicFramePr>
                     <a:graphicFrameLocks noChangeAspect="1"/>
@@ -9331,7 +11359,7 @@
                     <a:graphicData uri="http://schemas.openxmlformats.org/drawingml/2006/picture">
                       <pic:pic>
                         <pic:nvPicPr>
-                          <pic:cNvPr id="0" name="5edd97d2da7dda2f.png"/>
+                          <pic:cNvPr id="0" name="3318e4018b5ebb18.png"/>
                           <pic:cNvPicPr/>
                         </pic:nvPicPr>
                         <pic:blipFill>
@@ -9343,7 +11371,7 @@
                         <pic:spPr>
                           <a:xfrm>
                             <a:off x="0" y="0"/>
-                            <a:ext cx="2772554" cy="174967"/>
+                            <a:ext cx="3426604" cy="206641"/>
                           </a:xfrm>
                           <a:prstGeom prst="rect"/>
                         </pic:spPr>
@@ -9649,12 +11677,36 @@
               </w:rPr>
               <w:t xml:space="preserve"> </w:t>
             </w:r>
-            <w:r>
-              <w:rPr>
-                <w:rtl/>
-              </w:rPr>
-              <w:t xml:space="preserve">‎$\bar x=\RR{3{,}5}$</w:t>
-            </w:r>
+            <m:oMath>
+              <m:acc>
+                <m:accPr>
+                  <m:chr m:val="‾"/>
+                </m:accPr>
+                <m:e>
+                  <m:r>
+                    <m:t>x</m:t>
+                  </m:r>
+                </m:e>
+              </m:acc>
+              <m:r>
+                <m:rPr>
+                  <m:sty m:val="p"/>
+                </m:rPr>
+                <m:t>=</m:t>
+              </m:r>
+              <m:r>
+                <m:t>3</m:t>
+              </m:r>
+              <m:r>
+                <m:rPr>
+                  <m:sty m:val="p"/>
+                </m:rPr>
+                <m:t>,</m:t>
+              </m:r>
+              <m:r>
+                <m:t>5</m:t>
+              </m:r>
+            </m:oMath>
             <w:r>
               <w:rPr>
                 <w:rtl/>
@@ -9673,12 +11725,48 @@
               </w:rPr>
               <w:t xml:space="preserve"> </w:t>
             </w:r>
-            <w:r>
-              <w:rPr>
-                <w:rtl/>
-              </w:rPr>
-              <w:t xml:space="preserve">‎$\bar y=\dfrac{402}6=\RR{67}$</w:t>
-            </w:r>
+            <m:oMath>
+              <m:acc>
+                <m:accPr>
+                  <m:chr m:val="‾"/>
+                </m:accPr>
+                <m:e>
+                  <m:r>
+                    <m:t>y</m:t>
+                  </m:r>
+                </m:e>
+              </m:acc>
+              <m:r>
+                <m:rPr>
+                  <m:sty m:val="p"/>
+                </m:rPr>
+                <m:t>=</m:t>
+              </m:r>
+              <m:f>
+                <m:fPr>
+                  <m:type m:val="bar"/>
+                </m:fPr>
+                <m:num>
+                  <m:r>
+                    <m:t>402</m:t>
+                  </m:r>
+                </m:num>
+                <m:den>
+                  <m:r>
+                    <m:t>6</m:t>
+                  </m:r>
+                </m:den>
+              </m:f>
+              <m:r>
+                <m:rPr>
+                  <m:sty m:val="p"/>
+                </m:rPr>
+                <m:t>=</m:t>
+              </m:r>
+              <m:r>
+                <m:t>67</m:t>
+              </m:r>
+            </m:oMath>
             <w:r>
               <w:rPr>
                 <w:rtl/>
@@ -9691,12 +11779,42 @@
               </w:rPr>
               <w:t xml:space="preserve"> </w:t>
             </w:r>
-            <w:r>
-              <w:rPr>
-                <w:rtl/>
-              </w:rPr>
-              <w:t xml:space="preserve">‎$\RR{G(3{,}5;67)}$</w:t>
-            </w:r>
+            <m:oMath>
+              <m:r>
+                <m:t>G</m:t>
+              </m:r>
+              <m:d>
+                <m:dPr>
+                  <m:begChr m:val="("/>
+                  <m:endChr m:val=")"/>
+                  <m:sepChr m:val=""/>
+                  <m:grow/>
+                </m:dPr>
+                <m:e>
+                  <m:r>
+                    <m:t>3</m:t>
+                  </m:r>
+                  <m:r>
+                    <m:rPr>
+                      <m:sty m:val="p"/>
+                    </m:rPr>
+                    <m:t>,</m:t>
+                  </m:r>
+                  <m:r>
+                    <m:t>5</m:t>
+                  </m:r>
+                  <m:r>
+                    <m:rPr>
+                      <m:sty m:val="p"/>
+                    </m:rPr>
+                    <m:t>;</m:t>
+                  </m:r>
+                  <m:r>
+                    <m:t>67</m:t>
+                  </m:r>
+                </m:e>
+              </m:d>
+            </m:oMath>
             <w:r>
               <w:rPr>
                 <w:rtl/>
@@ -9927,12 +12045,125 @@
               <w:bidi/>
               <w:jc w:val="left"/>
             </w:pPr>
-            <w:r>
-              <w:rPr>
-                <w:rtl/>
-              </w:rPr>
-              <w:t xml:space="preserve">‎$a=\dfrac{252{,}5-3{,}5\times67}{2{,}917}=\dfrac{18}{2{,}917}\approx\RR{6{,}17}$</w:t>
-            </w:r>
+            <m:oMath>
+              <m:r>
+                <m:t>a</m:t>
+              </m:r>
+              <m:r>
+                <m:rPr>
+                  <m:sty m:val="p"/>
+                </m:rPr>
+                <m:t>=</m:t>
+              </m:r>
+              <m:f>
+                <m:fPr>
+                  <m:type m:val="bar"/>
+                </m:fPr>
+                <m:num>
+                  <m:r>
+                    <m:t>252</m:t>
+                  </m:r>
+                  <m:r>
+                    <m:rPr>
+                      <m:sty m:val="p"/>
+                    </m:rPr>
+                    <m:t>,</m:t>
+                  </m:r>
+                  <m:r>
+                    <m:t>5</m:t>
+                  </m:r>
+                  <m:r>
+                    <m:rPr>
+                      <m:sty m:val="p"/>
+                    </m:rPr>
+                    <m:t>−</m:t>
+                  </m:r>
+                  <m:r>
+                    <m:t>3</m:t>
+                  </m:r>
+                  <m:r>
+                    <m:rPr>
+                      <m:sty m:val="p"/>
+                    </m:rPr>
+                    <m:t>,</m:t>
+                  </m:r>
+                  <m:r>
+                    <m:t>5</m:t>
+                  </m:r>
+                  <m:r>
+                    <m:rPr>
+                      <m:sty m:val="p"/>
+                    </m:rPr>
+                    <m:t>×</m:t>
+                  </m:r>
+                  <m:r>
+                    <m:t>67</m:t>
+                  </m:r>
+                </m:num>
+                <m:den>
+                  <m:r>
+                    <m:t>2</m:t>
+                  </m:r>
+                  <m:r>
+                    <m:rPr>
+                      <m:sty m:val="p"/>
+                    </m:rPr>
+                    <m:t>,</m:t>
+                  </m:r>
+                  <m:r>
+                    <m:t>917</m:t>
+                  </m:r>
+                </m:den>
+              </m:f>
+              <m:r>
+                <m:rPr>
+                  <m:sty m:val="p"/>
+                </m:rPr>
+                <m:t>=</m:t>
+              </m:r>
+              <m:f>
+                <m:fPr>
+                  <m:type m:val="bar"/>
+                </m:fPr>
+                <m:num>
+                  <m:r>
+                    <m:t>18</m:t>
+                  </m:r>
+                </m:num>
+                <m:den>
+                  <m:r>
+                    <m:t>2</m:t>
+                  </m:r>
+                  <m:r>
+                    <m:rPr>
+                      <m:sty m:val="p"/>
+                    </m:rPr>
+                    <m:t>,</m:t>
+                  </m:r>
+                  <m:r>
+                    <m:t>917</m:t>
+                  </m:r>
+                </m:den>
+              </m:f>
+              <m:r>
+                <m:rPr>
+                  <m:sty m:val="p"/>
+                </m:rPr>
+                <m:t>≈</m:t>
+              </m:r>
+              <m:r>
+                <m:t>6</m:t>
+              </m:r>
+              <m:r>
+                <m:rPr>
+                  <m:sty m:val="p"/>
+                </m:rPr>
+                <m:t>,</m:t>
+              </m:r>
+              <m:r>
+                <m:t>17</m:t>
+              </m:r>
+            </m:oMath>
             <w:r>
               <w:rPr>
                 <w:rtl/>
@@ -9951,12 +12182,74 @@
               </w:rPr>
               <w:t xml:space="preserve"> </w:t>
             </w:r>
-            <w:r>
-              <w:rPr>
-                <w:rtl/>
-              </w:rPr>
-              <w:t xml:space="preserve">‎$b=67-6{,}17\times3{,}5\approx\RR{45{,}4}$</w:t>
-            </w:r>
+            <m:oMath>
+              <m:r>
+                <m:t>b</m:t>
+              </m:r>
+              <m:r>
+                <m:rPr>
+                  <m:sty m:val="p"/>
+                </m:rPr>
+                <m:t>=</m:t>
+              </m:r>
+              <m:r>
+                <m:t>67</m:t>
+              </m:r>
+              <m:r>
+                <m:rPr>
+                  <m:sty m:val="p"/>
+                </m:rPr>
+                <m:t>−</m:t>
+              </m:r>
+              <m:r>
+                <m:t>6</m:t>
+              </m:r>
+              <m:r>
+                <m:rPr>
+                  <m:sty m:val="p"/>
+                </m:rPr>
+                <m:t>,</m:t>
+              </m:r>
+              <m:r>
+                <m:t>17</m:t>
+              </m:r>
+              <m:r>
+                <m:rPr>
+                  <m:sty m:val="p"/>
+                </m:rPr>
+                <m:t>×</m:t>
+              </m:r>
+              <m:r>
+                <m:t>3</m:t>
+              </m:r>
+              <m:r>
+                <m:rPr>
+                  <m:sty m:val="p"/>
+                </m:rPr>
+                <m:t>,</m:t>
+              </m:r>
+              <m:r>
+                <m:t>5</m:t>
+              </m:r>
+              <m:r>
+                <m:rPr>
+                  <m:sty m:val="p"/>
+                </m:rPr>
+                <m:t>≈</m:t>
+              </m:r>
+              <m:r>
+                <m:t>45</m:t>
+              </m:r>
+              <m:r>
+                <m:rPr>
+                  <m:sty m:val="p"/>
+                </m:rPr>
+                <m:t>,</m:t>
+              </m:r>
+              <m:r>
+                <m:t>4</m:t>
+              </m:r>
+            </m:oMath>
             <w:r>
               <w:rPr>
                 <w:rtl/>
@@ -9975,7 +12268,7 @@
               </w:rPr>
               <w:drawing>
                 <wp:inline>
-                  <wp:extent cx="2772554" cy="1260964"/>
+                  <wp:extent cx="3241548" cy="1472184"/>
                   <wp:docPr id="11" name="Picture 11"/>
                   <wp:cNvGraphicFramePr>
                     <a:graphicFrameLocks noChangeAspect="1"/>
@@ -9984,7 +12277,7 @@
                     <a:graphicData uri="http://schemas.openxmlformats.org/drawingml/2006/picture">
                       <pic:pic>
                         <pic:nvPicPr>
-                          <pic:cNvPr id="0" name="beb7114d9a1bb8fe.png"/>
+                          <pic:cNvPr id="0" name="5684f3f6a5d1f703.png"/>
                           <pic:cNvPicPr/>
                         </pic:nvPicPr>
                         <pic:blipFill>
@@ -9996,7 +12289,7 @@
                         <pic:spPr>
                           <a:xfrm>
                             <a:off x="0" y="0"/>
-                            <a:ext cx="2772554" cy="1260964"/>
+                            <a:ext cx="3241548" cy="1472184"/>
                           </a:xfrm>
                           <a:prstGeom prst="rect"/>
                         </pic:spPr>
@@ -10052,12 +12345,74 @@
               </w:rPr>
               <w:t xml:space="preserve"> </w:t>
             </w:r>
-            <w:r>
-              <w:rPr>
-                <w:rtl/>
-              </w:rPr>
-              <w:t xml:space="preserve">‎$y\approx6{,}17\times8+45{,}4\approx\RR{94{,}8}$</w:t>
-            </w:r>
+            <m:oMath>
+              <m:r>
+                <m:t>y</m:t>
+              </m:r>
+              <m:r>
+                <m:rPr>
+                  <m:sty m:val="p"/>
+                </m:rPr>
+                <m:t>≈</m:t>
+              </m:r>
+              <m:r>
+                <m:t>6</m:t>
+              </m:r>
+              <m:r>
+                <m:rPr>
+                  <m:sty m:val="p"/>
+                </m:rPr>
+                <m:t>,</m:t>
+              </m:r>
+              <m:r>
+                <m:t>17</m:t>
+              </m:r>
+              <m:r>
+                <m:rPr>
+                  <m:sty m:val="p"/>
+                </m:rPr>
+                <m:t>×</m:t>
+              </m:r>
+              <m:r>
+                <m:t>8</m:t>
+              </m:r>
+              <m:r>
+                <m:rPr>
+                  <m:sty m:val="p"/>
+                </m:rPr>
+                <m:t>+</m:t>
+              </m:r>
+              <m:r>
+                <m:t>45</m:t>
+              </m:r>
+              <m:r>
+                <m:rPr>
+                  <m:sty m:val="p"/>
+                </m:rPr>
+                <m:t>,</m:t>
+              </m:r>
+              <m:r>
+                <m:t>4</m:t>
+              </m:r>
+              <m:r>
+                <m:rPr>
+                  <m:sty m:val="p"/>
+                </m:rPr>
+                <m:t>≈</m:t>
+              </m:r>
+              <m:r>
+                <m:t>94</m:t>
+              </m:r>
+              <m:r>
+                <m:rPr>
+                  <m:sty m:val="p"/>
+                </m:rPr>
+                <m:t>,</m:t>
+              </m:r>
+              <m:r>
+                <m:t>8</m:t>
+              </m:r>
+            </m:oMath>
             <w:r>
               <w:rPr>
                 <w:rtl/>
@@ -10218,7 +12573,72 @@
               <w:rPr>
                 <w:rtl/>
               </w:rPr>
-              <w:t xml:space="preserve">: .</w:t>
+              <w:t xml:space="preserve">:</w:t>
+            </w:r>
+            <w:r>
+              <w:rPr>
+                <w:rtl/>
+              </w:rPr>
+              <w:t xml:space="preserve"> </w:t>
+            </w:r>
+            <w:r>
+              <w:rPr>
+                <w:rtl/>
+              </w:rPr>
+              <w:t xml:space="preserve">ابتداءً</w:t>
+            </w:r>
+            <w:r>
+              <w:rPr>
+                <w:rtl/>
+              </w:rPr>
+              <w:t xml:space="preserve"> </w:t>
+            </w:r>
+            <w:r>
+              <w:rPr>
+                <w:rtl/>
+              </w:rPr>
+              <w:t xml:space="preserve">من</w:t>
+            </w:r>
+            <w:r>
+              <w:rPr>
+                <w:rtl/>
+              </w:rPr>
+              <w:t xml:space="preserve"> </w:t>
+            </w:r>
+            <w:r>
+              <w:rPr>
+                <w:rtl/>
+              </w:rPr>
+              <w:t xml:space="preserve">حوالي</w:t>
+            </w:r>
+            <w:r>
+              <w:rPr>
+                <w:rtl/>
+              </w:rPr>
+              <w:t xml:space="preserve"> </w:t>
+            </w:r>
+            <m:oMath>
+              <m:r>
+                <m:t>885</m:t>
+              </m:r>
+            </m:oMath>
+            <w:r>
+              <w:rPr>
+                <w:rtl/>
+              </w:rPr>
+              <w:t xml:space="preserve"> </w:t>
+            </w:r>
+            <w:r>
+              <w:rPr>
+                <w:rtl/>
+              </w:rPr>
+              <w:t xml:space="preserve">وحدة</w:t>
+            </w:r>
+            <w:r>
+              <w:rPr>
+                <w:rtl/>
+              </w:rPr>
+              <w:t xml:space="preserve">.</w:t>
             </w:r>
           </w:p>
         </w:tc>
@@ -10916,12 +13336,33 @@
               </w:rPr>
               <w:t xml:space="preserve"> </w:t>
             </w:r>
-            <w:r>
-              <w:rPr>
-                <w:rtl/>
-              </w:rPr>
-              <w:t xml:space="preserve">‎$\RR{G(3;175)}$</w:t>
-            </w:r>
+            <m:oMath>
+              <m:r>
+                <m:t>G</m:t>
+              </m:r>
+              <m:d>
+                <m:dPr>
+                  <m:begChr m:val="("/>
+                  <m:endChr m:val=")"/>
+                  <m:sepChr m:val=""/>
+                  <m:grow/>
+                </m:dPr>
+                <m:e>
+                  <m:r>
+                    <m:t>3</m:t>
+                  </m:r>
+                  <m:r>
+                    <m:rPr>
+                      <m:sty m:val="p"/>
+                    </m:rPr>
+                    <m:t>;</m:t>
+                  </m:r>
+                  <m:r>
+                    <m:t>175</m:t>
+                  </m:r>
+                </m:e>
+              </m:d>
+            </m:oMath>
             <w:r>
               <w:rPr>
                 <w:rtl/>
@@ -10940,12 +13381,50 @@
               </w:rPr>
               <w:t xml:space="preserve"> </w:t>
             </w:r>
-            <w:r>
-              <w:rPr>
-                <w:rtl/>
-              </w:rPr>
-              <w:t xml:space="preserve">‎$\RR{y=27{,}5x+92{,}5}$</w:t>
-            </w:r>
+            <m:oMath>
+              <m:r>
+                <m:t>y</m:t>
+              </m:r>
+              <m:r>
+                <m:rPr>
+                  <m:sty m:val="p"/>
+                </m:rPr>
+                <m:t>=</m:t>
+              </m:r>
+              <m:r>
+                <m:t>27</m:t>
+              </m:r>
+              <m:r>
+                <m:rPr>
+                  <m:sty m:val="p"/>
+                </m:rPr>
+                <m:t>,</m:t>
+              </m:r>
+              <m:r>
+                <m:t>5</m:t>
+              </m:r>
+              <m:r>
+                <m:t>x</m:t>
+              </m:r>
+              <m:r>
+                <m:rPr>
+                  <m:sty m:val="p"/>
+                </m:rPr>
+                <m:t>+</m:t>
+              </m:r>
+              <m:r>
+                <m:t>92</m:t>
+              </m:r>
+              <m:r>
+                <m:rPr>
+                  <m:sty m:val="p"/>
+                </m:rPr>
+                <m:t>,</m:t>
+              </m:r>
+              <m:r>
+                <m:t>5</m:t>
+              </m:r>
+            </m:oMath>
             <w:r>
               <w:rPr>
                 <w:rtl/>
@@ -10978,12 +13457,74 @@
               </w:rPr>
               <w:t xml:space="preserve"> </w:t>
             </w:r>
-            <w:r>
-              <w:rPr>
-                <w:rtl/>
-              </w:rPr>
-              <w:t xml:space="preserve">‎$y=27{,}5\times6+92{,}5=\RR{257{,}5}$</w:t>
-            </w:r>
+            <m:oMath>
+              <m:r>
+                <m:t>y</m:t>
+              </m:r>
+              <m:r>
+                <m:rPr>
+                  <m:sty m:val="p"/>
+                </m:rPr>
+                <m:t>=</m:t>
+              </m:r>
+              <m:r>
+                <m:t>27</m:t>
+              </m:r>
+              <m:r>
+                <m:rPr>
+                  <m:sty m:val="p"/>
+                </m:rPr>
+                <m:t>,</m:t>
+              </m:r>
+              <m:r>
+                <m:t>5</m:t>
+              </m:r>
+              <m:r>
+                <m:rPr>
+                  <m:sty m:val="p"/>
+                </m:rPr>
+                <m:t>×</m:t>
+              </m:r>
+              <m:r>
+                <m:t>6</m:t>
+              </m:r>
+              <m:r>
+                <m:rPr>
+                  <m:sty m:val="p"/>
+                </m:rPr>
+                <m:t>+</m:t>
+              </m:r>
+              <m:r>
+                <m:t>92</m:t>
+              </m:r>
+              <m:r>
+                <m:rPr>
+                  <m:sty m:val="p"/>
+                </m:rPr>
+                <m:t>,</m:t>
+              </m:r>
+              <m:r>
+                <m:t>5</m:t>
+              </m:r>
+              <m:r>
+                <m:rPr>
+                  <m:sty m:val="p"/>
+                </m:rPr>
+                <m:t>=</m:t>
+              </m:r>
+              <m:r>
+                <m:t>257</m:t>
+              </m:r>
+              <m:r>
+                <m:rPr>
+                  <m:sty m:val="p"/>
+                </m:rPr>
+                <m:t>,</m:t>
+              </m:r>
+              <m:r>
+                <m:t>5</m:t>
+              </m:r>
+            </m:oMath>
             <w:r>
               <w:rPr>
                 <w:rtl/>

</xml_diff>